<commit_message>
Simplify the grade 5 lesson to multiplication properties only.
Drop pages 64–65, the minute-by-minute script, and the stiff phrasing so the plan reads like a normal class.

Co-authored-by: Beka Tevdorashvili <bekatev@users.noreply.github.com>
</commit_message>
<xml_diff>
--- a/lesson/sagakvetilo-gegma.docx
+++ b/lesson/sagakvetilo-gegma.docx
@@ -79,7 +79,7 @@
                 <w:color w:val="FFE4C4"/>
                 <w:sz w:val="24"/>
               </w:rPr>
-              <w:t>40 წუთი  ·  გამრავლების თვისებები და ნულების ხრიკი</w:t>
+              <w:t>გამრავლების თვისებები  ·  40 წუთი</w:t>
             </w:r>
           </w:p>
         </w:tc>
@@ -144,7 +144,7 @@
                 <w:color w:val="8E2F3C"/>
                 <w:sz w:val="22"/>
               </w:rPr>
-              <w:t>თემა ჟურნალისთვის</w:t>
+              <w:t>თემა</w:t>
             </w:r>
           </w:p>
         </w:tc>
@@ -180,7 +180,7 @@
                 <w:color w:val="1C2430"/>
                 <w:sz w:val="22"/>
               </w:rPr>
-              <w:t>ნატურალურ რიცხვათა გამრავლება — თვისებები, ნულებით დამთავრებული რიცხვები და ნამრავლის შეფასება</w:t>
+              <w:t>ნატურალური რიცხვების გამრავლება. გამრავლების თვისებები</w:t>
             </w:r>
           </w:p>
         </w:tc>
@@ -257,7 +257,7 @@
                 <w:color w:val="1C2430"/>
                 <w:sz w:val="22"/>
               </w:rPr>
-              <w:t>გვ. 56–57 (თვისებები) და გვ. 64–65 (შეფასება, ნულები)</w:t>
+              <w:t>გვ. 56–57</w:t>
             </w:r>
           </w:p>
         </w:tc>
@@ -334,7 +334,7 @@
                 <w:color w:val="1C2430"/>
                 <w:sz w:val="22"/>
               </w:rPr>
-              <w:t>prezentacia.html — 15 სლაიდი, იხსნება ბრაუზერში ორჯერ დაწკაპუნებით</w:t>
+              <w:t>prezentacia.html — იხსნება ბრაუზერში. fonts-ის საქაღალდე თან უნდა იყოს</w:t>
             </w:r>
           </w:p>
         </w:tc>
@@ -411,7 +411,7 @@
                 <w:color w:val="1C2430"/>
                 <w:sz w:val="22"/>
               </w:rPr>
-              <w:t>სკოლა ____________________    მასწავლებელი ____________________    თარიღი __________</w:t>
+              <w:t>მასწავლებელი ____________________    თარიღი __________</w:t>
             </w:r>
           </w:p>
         </w:tc>
@@ -429,7 +429,7 @@
           <w:color w:val="8E2F3C"/>
           <w:sz w:val="28"/>
         </w:rPr>
-        <w:t>რაზეა ეს 40 წუთი</w:t>
+        <w:t>მიზანი</w:t>
       </w:r>
     </w:p>
     <w:p>
@@ -444,163 +444,7 @@
           <w:color w:val="1C2430"/>
           <w:sz w:val="24"/>
         </w:rPr>
-        <w:t>თვისებებს ცალ-ცალკე ზეპირს არ ვაძლევთ. ერთ ხრიკამდე მივყავართ: ჯერ ციფრები მრავლდება, ნულები ბოლოს ემატება. ბოლოს ერთი შეფასება — მეტია თუ ნაკლები, ზუსტი გამრავლების გარეშე.</w:t>
-      </w:r>
-    </w:p>
-    <w:tbl>
-      <w:tblPr>
-        <w:tblW w:type="pct" w:w="5000"/>
-        <w:tblLook w:firstColumn="1" w:firstRow="1" w:lastColumn="0" w:lastRow="0" w:noHBand="0" w:noVBand="1" w:val="04A0"/>
-        <w:tblBorders>
-          <w:top w:val="nil"/>
-          <w:left w:val="nil"/>
-          <w:bottom w:val="nil"/>
-          <w:right w:val="nil"/>
-          <w:insideH w:val="nil"/>
-          <w:insideV w:val="nil"/>
-        </w:tblBorders>
-      </w:tblPr>
-      <w:tblGrid>
-        <w:gridCol w:w="10206"/>
-      </w:tblGrid>
-      <w:tr>
-        <w:tc>
-          <w:tcPr>
-            <w:tcW w:type="dxa" w:w="10206"/>
-            <w:shd w:val="clear" w:fill="F3FAF7"/>
-            <w:tcBorders>
-              <w:top w:val="single" w:sz="12" w:space="0" w:color="0F7A6E"/>
-              <w:left w:val="single" w:sz="12" w:space="0" w:color="0F7A6E"/>
-              <w:bottom w:val="single" w:sz="12" w:space="0" w:color="0F7A6E"/>
-              <w:right w:val="single" w:sz="12" w:space="0" w:color="0F7A6E"/>
-            </w:tcBorders>
-            <w:tcMar>
-              <w:top w:w="80" w:type="dxa"/>
-              <w:left w:w="120" w:type="dxa"/>
-              <w:bottom w:w="80" w:type="dxa"/>
-              <w:right w:w="120" w:type="dxa"/>
-            </w:tcMar>
-          </w:tcPr>
-          <w:p>
-            <w:pPr>
-              <w:spacing w:before="0" w:after="40" w:line="259" w:lineRule="auto"/>
-            </w:pPr>
-            <w:r/>
-            <w:r>
-              <w:rPr>
-                <w:rFonts w:ascii="Sylfaen" w:hAnsi="Sylfaen" w:cs="Sylfaen" w:eastAsia="Sylfaen"/>
-                <w:b/>
-                <w:i w:val="0"/>
-                <w:color w:val="0F7A6E"/>
-                <w:sz w:val="24"/>
-              </w:rPr>
-              <w:t>მიზანი</w:t>
-            </w:r>
-          </w:p>
-          <w:p>
-            <w:pPr>
-              <w:spacing w:before="0" w:after="0" w:line="259" w:lineRule="auto"/>
-            </w:pPr>
-            <w:r>
-              <w:rPr>
-                <w:rFonts w:ascii="Sylfaen" w:hAnsi="Sylfaen" w:cs="Sylfaen" w:eastAsia="Sylfaen"/>
-                <w:b w:val="0"/>
-                <w:i w:val="0"/>
-                <w:color w:val="1C2430"/>
-                <w:sz w:val="22"/>
-              </w:rPr>
-              <w:t>მოსწავლემ თვისება ამოიცნოს, ნულით დამთავრებული რიცხვი სწრაფად გაამრავლოს და ნამრავლი დაახლოებით შეაფასოს.</w:t>
-            </w:r>
-          </w:p>
-        </w:tc>
-      </w:tr>
-    </w:tbl>
-    <w:p>
-      <w:pPr>
-        <w:spacing w:before="240" w:after="80" w:line="259" w:lineRule="auto"/>
-      </w:pPr>
-      <w:r>
-        <w:rPr>
-          <w:rFonts w:ascii="Sylfaen" w:hAnsi="Sylfaen" w:cs="Sylfaen" w:eastAsia="Sylfaen"/>
-          <w:b/>
-          <w:i w:val="0"/>
-          <w:color w:val="8E2F3C"/>
-          <w:sz w:val="28"/>
-        </w:rPr>
-        <w:t>გაკვეთილის ბოლოს მოსწავლე</w:t>
-      </w:r>
-    </w:p>
-    <w:p>
-      <w:pPr>
-        <w:spacing w:before="0" w:after="40" w:line="259" w:lineRule="auto"/>
-        <w:ind w:left="340"/>
-      </w:pPr>
-      <w:r>
-        <w:rPr>
-          <w:rFonts w:ascii="Sylfaen" w:hAnsi="Sylfaen" w:cs="Sylfaen" w:eastAsia="Sylfaen"/>
-          <w:b w:val="0"/>
-          <w:i w:val="0"/>
-          <w:color w:val="1C2430"/>
-          <w:sz w:val="22"/>
-        </w:rPr>
-        <w:t>•  მაგალითზე ამოიცნობს გადანაცვლების, ერთის, ნულის, ჯგუფებისა და განაწილების თვისებას;</w:t>
-      </w:r>
-    </w:p>
-    <w:p>
-      <w:pPr>
-        <w:spacing w:before="0" w:after="40" w:line="259" w:lineRule="auto"/>
-        <w:ind w:left="340"/>
-      </w:pPr>
-      <w:r>
-        <w:rPr>
-          <w:rFonts w:ascii="Sylfaen" w:hAnsi="Sylfaen" w:cs="Sylfaen" w:eastAsia="Sylfaen"/>
-          <w:b w:val="0"/>
-          <w:i w:val="0"/>
-          <w:color w:val="1C2430"/>
-          <w:sz w:val="22"/>
-        </w:rPr>
-        <w:t>•  50·30-ის ტიპის ნამრავლს ასე ხსნის: ჯერ ციფრები, მერე ყველა ნული;</w:t>
-      </w:r>
-    </w:p>
-    <w:p>
-      <w:pPr>
-        <w:spacing w:before="0" w:after="40" w:line="259" w:lineRule="auto"/>
-        <w:ind w:left="340"/>
-      </w:pPr>
-      <w:r>
-        <w:rPr>
-          <w:rFonts w:ascii="Sylfaen" w:hAnsi="Sylfaen" w:cs="Sylfaen" w:eastAsia="Sylfaen"/>
-          <w:b w:val="0"/>
-          <w:i w:val="0"/>
-          <w:color w:val="1C2430"/>
-          <w:sz w:val="22"/>
-        </w:rPr>
-        <w:t>•  ორ რიცხვს უმაღლეს თანრიგამდე ამრგვალებს და ამბობს, ნამრავლი მეტია თუ ნაკლები მოცემულ რიცხვზე.</w:t>
-      </w:r>
-    </w:p>
-    <w:p>
-      <w:pPr>
-        <w:spacing w:before="80" w:after="40" w:line="252" w:lineRule="auto"/>
-      </w:pPr>
-      <w:r>
-        <w:rPr>
-          <w:rFonts w:ascii="Sylfaen" w:hAnsi="Sylfaen" w:cs="Sylfaen" w:eastAsia="Sylfaen"/>
-          <w:b/>
-          <w:i w:val="0"/>
-          <w:color w:val="8E2F3C"/>
-          <w:sz w:val="22"/>
-        </w:rPr>
-        <w:t xml:space="preserve">დღეს არ შედის. </w:t>
-      </w:r>
-      <w:r>
-        <w:rPr>
-          <w:rFonts w:ascii="Sylfaen" w:hAnsi="Sylfaen" w:cs="Sylfaen" w:eastAsia="Sylfaen"/>
-          <w:b w:val="0"/>
-          <w:i w:val="0"/>
-          <w:color w:val="1C2430"/>
-          <w:sz w:val="22"/>
-        </w:rPr>
-        <w:t>სვეტად გამრავლება (4 707 × 465, გვ. 65) ცალკე სავარჯიშოა. ამ 40 წუთში მხოლოდ ვახსენებთ, თუ კლასი თვითონ მოითხოვს.</w:t>
+        <w:t>მოსწავლემ გაიხსენოს გამრავლების თვისებები და მაგალითში ამოიცნოს, რომელი მათგანია გამოყენებული.</w:t>
       </w:r>
     </w:p>
     <w:p>
@@ -618,1481 +462,9 @@
         <w:t>მსვლელობა</w:t>
       </w:r>
     </w:p>
-    <w:tbl>
-      <w:tblPr>
-        <w:tblW w:type="pct" w:w="5000"/>
-        <w:tblLook w:firstColumn="1" w:firstRow="1" w:lastColumn="0" w:lastRow="0" w:noHBand="0" w:noVBand="1" w:val="04A0"/>
-        <w:tblBorders>
-          <w:top w:val="nil"/>
-          <w:left w:val="nil"/>
-          <w:bottom w:val="nil"/>
-          <w:right w:val="nil"/>
-          <w:insideH w:val="nil"/>
-          <w:insideV w:val="nil"/>
-        </w:tblBorders>
-      </w:tblPr>
-      <w:tblGrid>
-        <w:gridCol w:w="2551"/>
-        <w:gridCol w:w="2551"/>
-        <w:gridCol w:w="2551"/>
-        <w:gridCol w:w="2551"/>
-      </w:tblGrid>
-      <w:tr>
-        <w:trPr>
-          <w:cantSplit/>
-        </w:trPr>
-        <w:tc>
-          <w:tcPr>
-            <w:tcW w:type="dxa" w:w="1191"/>
-            <w:shd w:val="clear" w:fill="1C2430"/>
-            <w:tcBorders>
-              <w:top w:val="single" w:sz="4" w:space="0" w:color="E7DCCB"/>
-              <w:left w:val="single" w:sz="4" w:space="0" w:color="E7DCCB"/>
-              <w:bottom w:val="single" w:sz="4" w:space="0" w:color="E7DCCB"/>
-              <w:right w:val="single" w:sz="4" w:space="0" w:color="E7DCCB"/>
-            </w:tcBorders>
-            <w:tcMar>
-              <w:top w:w="60" w:type="dxa"/>
-              <w:left w:w="80" w:type="dxa"/>
-              <w:bottom w:w="60" w:type="dxa"/>
-              <w:right w:w="80" w:type="dxa"/>
-            </w:tcMar>
-            <w:vAlign w:val="center"/>
-          </w:tcPr>
-          <w:p>
-            <w:pPr>
-              <w:spacing w:before="0" w:after="0" w:line="252" w:lineRule="auto"/>
-              <w:jc w:val="left"/>
-            </w:pPr>
-            <w:r/>
-            <w:r>
-              <w:rPr>
-                <w:rFonts w:ascii="Sylfaen" w:hAnsi="Sylfaen" w:cs="Sylfaen" w:eastAsia="Sylfaen"/>
-                <w:b/>
-                <w:i w:val="0"/>
-                <w:color w:val="FFFFFF"/>
-                <w:sz w:val="20"/>
-              </w:rPr>
-              <w:t>დრო</w:t>
-            </w:r>
-          </w:p>
-        </w:tc>
-        <w:tc>
-          <w:tcPr>
-            <w:tcW w:type="dxa" w:w="1757"/>
-            <w:shd w:val="clear" w:fill="1C2430"/>
-            <w:tcBorders>
-              <w:top w:val="single" w:sz="4" w:space="0" w:color="E7DCCB"/>
-              <w:left w:val="single" w:sz="4" w:space="0" w:color="E7DCCB"/>
-              <w:bottom w:val="single" w:sz="4" w:space="0" w:color="E7DCCB"/>
-              <w:right w:val="single" w:sz="4" w:space="0" w:color="E7DCCB"/>
-            </w:tcBorders>
-            <w:tcMar>
-              <w:top w:w="60" w:type="dxa"/>
-              <w:left w:w="80" w:type="dxa"/>
-              <w:bottom w:w="60" w:type="dxa"/>
-              <w:right w:w="80" w:type="dxa"/>
-            </w:tcMar>
-            <w:vAlign w:val="center"/>
-          </w:tcPr>
-          <w:p>
-            <w:pPr>
-              <w:spacing w:before="0" w:after="0" w:line="252" w:lineRule="auto"/>
-              <w:jc w:val="left"/>
-            </w:pPr>
-            <w:r/>
-            <w:r>
-              <w:rPr>
-                <w:rFonts w:ascii="Sylfaen" w:hAnsi="Sylfaen" w:cs="Sylfaen" w:eastAsia="Sylfaen"/>
-                <w:b/>
-                <w:i w:val="0"/>
-                <w:color w:val="FFFFFF"/>
-                <w:sz w:val="20"/>
-              </w:rPr>
-              <w:t>ეტაპი</w:t>
-            </w:r>
-          </w:p>
-        </w:tc>
-        <w:tc>
-          <w:tcPr>
-            <w:tcW w:type="dxa" w:w="1247"/>
-            <w:shd w:val="clear" w:fill="1C2430"/>
-            <w:tcBorders>
-              <w:top w:val="single" w:sz="4" w:space="0" w:color="E7DCCB"/>
-              <w:left w:val="single" w:sz="4" w:space="0" w:color="E7DCCB"/>
-              <w:bottom w:val="single" w:sz="4" w:space="0" w:color="E7DCCB"/>
-              <w:right w:val="single" w:sz="4" w:space="0" w:color="E7DCCB"/>
-            </w:tcBorders>
-            <w:tcMar>
-              <w:top w:w="60" w:type="dxa"/>
-              <w:left w:w="80" w:type="dxa"/>
-              <w:bottom w:w="60" w:type="dxa"/>
-              <w:right w:w="80" w:type="dxa"/>
-            </w:tcMar>
-            <w:vAlign w:val="center"/>
-          </w:tcPr>
-          <w:p>
-            <w:pPr>
-              <w:spacing w:before="0" w:after="0" w:line="252" w:lineRule="auto"/>
-              <w:jc w:val="left"/>
-            </w:pPr>
-            <w:r/>
-            <w:r>
-              <w:rPr>
-                <w:rFonts w:ascii="Sylfaen" w:hAnsi="Sylfaen" w:cs="Sylfaen" w:eastAsia="Sylfaen"/>
-                <w:b/>
-                <w:i w:val="0"/>
-                <w:color w:val="FFFFFF"/>
-                <w:sz w:val="20"/>
-              </w:rPr>
-              <w:t>სლაიდი</w:t>
-            </w:r>
-          </w:p>
-        </w:tc>
-        <w:tc>
-          <w:tcPr>
-            <w:tcW w:type="dxa" w:w="5783"/>
-            <w:shd w:val="clear" w:fill="1C2430"/>
-            <w:tcBorders>
-              <w:top w:val="single" w:sz="4" w:space="0" w:color="E7DCCB"/>
-              <w:left w:val="single" w:sz="4" w:space="0" w:color="E7DCCB"/>
-              <w:bottom w:val="single" w:sz="4" w:space="0" w:color="E7DCCB"/>
-              <w:right w:val="single" w:sz="4" w:space="0" w:color="E7DCCB"/>
-            </w:tcBorders>
-            <w:tcMar>
-              <w:top w:w="60" w:type="dxa"/>
-              <w:left w:w="80" w:type="dxa"/>
-              <w:bottom w:w="60" w:type="dxa"/>
-              <w:right w:w="80" w:type="dxa"/>
-            </w:tcMar>
-            <w:vAlign w:val="center"/>
-          </w:tcPr>
-          <w:p>
-            <w:pPr>
-              <w:spacing w:before="0" w:after="0" w:line="252" w:lineRule="auto"/>
-              <w:jc w:val="left"/>
-            </w:pPr>
-            <w:r/>
-            <w:r>
-              <w:rPr>
-                <w:rFonts w:ascii="Sylfaen" w:hAnsi="Sylfaen" w:cs="Sylfaen" w:eastAsia="Sylfaen"/>
-                <w:b/>
-                <w:i w:val="0"/>
-                <w:color w:val="FFFFFF"/>
-                <w:sz w:val="20"/>
-              </w:rPr>
-              <w:t>რა ხდება კლასში</w:t>
-            </w:r>
-          </w:p>
-        </w:tc>
-      </w:tr>
-      <w:tr>
-        <w:trPr>
-          <w:cantSplit/>
-        </w:trPr>
-        <w:tc>
-          <w:tcPr>
-            <w:tcW w:type="dxa" w:w="1191"/>
-            <w:shd w:val="clear" w:fill="FBF6EE"/>
-            <w:tcBorders>
-              <w:top w:val="single" w:sz="4" w:space="0" w:color="E7DCCB"/>
-              <w:left w:val="single" w:sz="4" w:space="0" w:color="E7DCCB"/>
-              <w:bottom w:val="single" w:sz="4" w:space="0" w:color="E7DCCB"/>
-              <w:right w:val="single" w:sz="4" w:space="0" w:color="E7DCCB"/>
-            </w:tcBorders>
-            <w:tcMar>
-              <w:top w:w="60" w:type="dxa"/>
-              <w:left w:w="80" w:type="dxa"/>
-              <w:bottom w:w="60" w:type="dxa"/>
-              <w:right w:w="80" w:type="dxa"/>
-            </w:tcMar>
-            <w:vAlign w:val="center"/>
-          </w:tcPr>
-          <w:p>
-            <w:pPr>
-              <w:spacing w:before="0" w:after="0" w:line="252" w:lineRule="auto"/>
-              <w:jc w:val="left"/>
-            </w:pPr>
-            <w:r/>
-            <w:r>
-              <w:rPr>
-                <w:rFonts w:ascii="Sylfaen" w:hAnsi="Sylfaen" w:cs="Sylfaen" w:eastAsia="Sylfaen"/>
-                <w:b/>
-                <w:i w:val="0"/>
-                <w:color w:val="1C2430"/>
-                <w:sz w:val="21"/>
-              </w:rPr>
-              <w:t>4 წთ</w:t>
-            </w:r>
-          </w:p>
-        </w:tc>
-        <w:tc>
-          <w:tcPr>
-            <w:tcW w:type="dxa" w:w="1757"/>
-            <w:shd w:val="clear" w:fill="FBF6EE"/>
-            <w:tcBorders>
-              <w:top w:val="single" w:sz="4" w:space="0" w:color="E7DCCB"/>
-              <w:left w:val="single" w:sz="4" w:space="0" w:color="E7DCCB"/>
-              <w:bottom w:val="single" w:sz="4" w:space="0" w:color="E7DCCB"/>
-              <w:right w:val="single" w:sz="4" w:space="0" w:color="E7DCCB"/>
-            </w:tcBorders>
-            <w:tcMar>
-              <w:top w:w="60" w:type="dxa"/>
-              <w:left w:w="80" w:type="dxa"/>
-              <w:bottom w:w="60" w:type="dxa"/>
-              <w:right w:w="80" w:type="dxa"/>
-            </w:tcMar>
-            <w:vAlign w:val="center"/>
-          </w:tcPr>
-          <w:p>
-            <w:pPr>
-              <w:spacing w:before="0" w:after="0" w:line="252" w:lineRule="auto"/>
-              <w:jc w:val="left"/>
-            </w:pPr>
-            <w:r/>
-            <w:r>
-              <w:rPr>
-                <w:rFonts w:ascii="Sylfaen" w:hAnsi="Sylfaen" w:cs="Sylfaen" w:eastAsia="Sylfaen"/>
-                <w:b/>
-                <w:i w:val="0"/>
-                <w:color w:val="1C2430"/>
-                <w:sz w:val="21"/>
-              </w:rPr>
-              <w:t>გახსნა</w:t>
-            </w:r>
-          </w:p>
-        </w:tc>
-        <w:tc>
-          <w:tcPr>
-            <w:tcW w:type="dxa" w:w="1247"/>
-            <w:shd w:val="clear" w:fill="FBF6EE"/>
-            <w:tcBorders>
-              <w:top w:val="single" w:sz="4" w:space="0" w:color="E7DCCB"/>
-              <w:left w:val="single" w:sz="4" w:space="0" w:color="E7DCCB"/>
-              <w:bottom w:val="single" w:sz="4" w:space="0" w:color="E7DCCB"/>
-              <w:right w:val="single" w:sz="4" w:space="0" w:color="E7DCCB"/>
-            </w:tcBorders>
-            <w:tcMar>
-              <w:top w:w="60" w:type="dxa"/>
-              <w:left w:w="80" w:type="dxa"/>
-              <w:bottom w:w="60" w:type="dxa"/>
-              <w:right w:w="80" w:type="dxa"/>
-            </w:tcMar>
-            <w:vAlign w:val="center"/>
-          </w:tcPr>
-          <w:p>
-            <w:pPr>
-              <w:spacing w:before="0" w:after="0" w:line="252" w:lineRule="auto"/>
-              <w:jc w:val="left"/>
-            </w:pPr>
-            <w:r/>
-            <w:r>
-              <w:rPr>
-                <w:rFonts w:ascii="Sylfaen" w:hAnsi="Sylfaen" w:cs="Sylfaen" w:eastAsia="Sylfaen"/>
-                <w:b/>
-                <w:i w:val="0"/>
-                <w:color w:val="1C2430"/>
-                <w:sz w:val="21"/>
-              </w:rPr>
-              <w:t>1–2</w:t>
-            </w:r>
-          </w:p>
-        </w:tc>
-        <w:tc>
-          <w:tcPr>
-            <w:tcW w:type="dxa" w:w="5783"/>
-            <w:shd w:val="clear" w:fill="FBF6EE"/>
-            <w:tcBorders>
-              <w:top w:val="single" w:sz="4" w:space="0" w:color="E7DCCB"/>
-              <w:left w:val="single" w:sz="4" w:space="0" w:color="E7DCCB"/>
-              <w:bottom w:val="single" w:sz="4" w:space="0" w:color="E7DCCB"/>
-              <w:right w:val="single" w:sz="4" w:space="0" w:color="E7DCCB"/>
-            </w:tcBorders>
-            <w:tcMar>
-              <w:top w:w="60" w:type="dxa"/>
-              <w:left w:w="80" w:type="dxa"/>
-              <w:bottom w:w="60" w:type="dxa"/>
-              <w:right w:w="80" w:type="dxa"/>
-            </w:tcMar>
-            <w:vAlign w:val="center"/>
-          </w:tcPr>
-          <w:p>
-            <w:pPr>
-              <w:spacing w:before="0" w:after="0" w:line="252" w:lineRule="auto"/>
-              <w:jc w:val="left"/>
-            </w:pPr>
-            <w:r/>
-            <w:r>
-              <w:rPr>
-                <w:rFonts w:ascii="Sylfaen" w:hAnsi="Sylfaen" w:cs="Sylfaen" w:eastAsia="Sylfaen"/>
-                <w:b w:val="0"/>
-                <w:i w:val="0"/>
-                <w:color w:val="1C2430"/>
-                <w:sz w:val="21"/>
-              </w:rPr>
-              <w:t>ხუთ მოსწავლეს თითო 6 ფანქარი აქვს. ჯერ კლასმა თქვას, როგორ დათვლიდა. მერე გაიხსნას ორივე გზა: შეკრებაც და 5·6-იც 30-ია.</w:t>
-            </w:r>
-          </w:p>
-        </w:tc>
-      </w:tr>
-      <w:tr>
-        <w:trPr>
-          <w:cantSplit/>
-        </w:trPr>
-        <w:tc>
-          <w:tcPr>
-            <w:tcW w:type="dxa" w:w="1191"/>
-            <w:shd w:val="clear" w:fill="FFFFFF"/>
-            <w:tcBorders>
-              <w:top w:val="single" w:sz="4" w:space="0" w:color="E7DCCB"/>
-              <w:left w:val="single" w:sz="4" w:space="0" w:color="E7DCCB"/>
-              <w:bottom w:val="single" w:sz="4" w:space="0" w:color="E7DCCB"/>
-              <w:right w:val="single" w:sz="4" w:space="0" w:color="E7DCCB"/>
-            </w:tcBorders>
-            <w:tcMar>
-              <w:top w:w="60" w:type="dxa"/>
-              <w:left w:w="80" w:type="dxa"/>
-              <w:bottom w:w="60" w:type="dxa"/>
-              <w:right w:w="80" w:type="dxa"/>
-            </w:tcMar>
-            <w:vAlign w:val="center"/>
-          </w:tcPr>
-          <w:p>
-            <w:pPr>
-              <w:spacing w:before="0" w:after="0" w:line="252" w:lineRule="auto"/>
-              <w:jc w:val="left"/>
-            </w:pPr>
-            <w:r/>
-            <w:r>
-              <w:rPr>
-                <w:rFonts w:ascii="Sylfaen" w:hAnsi="Sylfaen" w:cs="Sylfaen" w:eastAsia="Sylfaen"/>
-                <w:b/>
-                <w:i w:val="0"/>
-                <w:color w:val="1C2430"/>
-                <w:sz w:val="21"/>
-              </w:rPr>
-              <w:t>3 წთ</w:t>
-            </w:r>
-          </w:p>
-        </w:tc>
-        <w:tc>
-          <w:tcPr>
-            <w:tcW w:type="dxa" w:w="1757"/>
-            <w:shd w:val="clear" w:fill="FFFFFF"/>
-            <w:tcBorders>
-              <w:top w:val="single" w:sz="4" w:space="0" w:color="E7DCCB"/>
-              <w:left w:val="single" w:sz="4" w:space="0" w:color="E7DCCB"/>
-              <w:bottom w:val="single" w:sz="4" w:space="0" w:color="E7DCCB"/>
-              <w:right w:val="single" w:sz="4" w:space="0" w:color="E7DCCB"/>
-            </w:tcBorders>
-            <w:tcMar>
-              <w:top w:w="60" w:type="dxa"/>
-              <w:left w:w="80" w:type="dxa"/>
-              <w:bottom w:w="60" w:type="dxa"/>
-              <w:right w:w="80" w:type="dxa"/>
-            </w:tcMar>
-            <w:vAlign w:val="center"/>
-          </w:tcPr>
-          <w:p>
-            <w:pPr>
-              <w:spacing w:before="0" w:after="0" w:line="252" w:lineRule="auto"/>
-              <w:jc w:val="left"/>
-            </w:pPr>
-            <w:r/>
-            <w:r>
-              <w:rPr>
-                <w:rFonts w:ascii="Sylfaen" w:hAnsi="Sylfaen" w:cs="Sylfaen" w:eastAsia="Sylfaen"/>
-                <w:b/>
-                <w:i w:val="0"/>
-                <w:color w:val="1C2430"/>
-                <w:sz w:val="21"/>
-              </w:rPr>
-              <w:t>სიტყვები</w:t>
-            </w:r>
-          </w:p>
-        </w:tc>
-        <w:tc>
-          <w:tcPr>
-            <w:tcW w:type="dxa" w:w="1247"/>
-            <w:shd w:val="clear" w:fill="FFFFFF"/>
-            <w:tcBorders>
-              <w:top w:val="single" w:sz="4" w:space="0" w:color="E7DCCB"/>
-              <w:left w:val="single" w:sz="4" w:space="0" w:color="E7DCCB"/>
-              <w:bottom w:val="single" w:sz="4" w:space="0" w:color="E7DCCB"/>
-              <w:right w:val="single" w:sz="4" w:space="0" w:color="E7DCCB"/>
-            </w:tcBorders>
-            <w:tcMar>
-              <w:top w:w="60" w:type="dxa"/>
-              <w:left w:w="80" w:type="dxa"/>
-              <w:bottom w:w="60" w:type="dxa"/>
-              <w:right w:w="80" w:type="dxa"/>
-            </w:tcMar>
-            <w:vAlign w:val="center"/>
-          </w:tcPr>
-          <w:p>
-            <w:pPr>
-              <w:spacing w:before="0" w:after="0" w:line="252" w:lineRule="auto"/>
-              <w:jc w:val="left"/>
-            </w:pPr>
-            <w:r/>
-            <w:r>
-              <w:rPr>
-                <w:rFonts w:ascii="Sylfaen" w:hAnsi="Sylfaen" w:cs="Sylfaen" w:eastAsia="Sylfaen"/>
-                <w:b/>
-                <w:i w:val="0"/>
-                <w:color w:val="1C2430"/>
-                <w:sz w:val="21"/>
-              </w:rPr>
-              <w:t>3</w:t>
-            </w:r>
-          </w:p>
-        </w:tc>
-        <w:tc>
-          <w:tcPr>
-            <w:tcW w:type="dxa" w:w="5783"/>
-            <w:shd w:val="clear" w:fill="FFFFFF"/>
-            <w:tcBorders>
-              <w:top w:val="single" w:sz="4" w:space="0" w:color="E7DCCB"/>
-              <w:left w:val="single" w:sz="4" w:space="0" w:color="E7DCCB"/>
-              <w:bottom w:val="single" w:sz="4" w:space="0" w:color="E7DCCB"/>
-              <w:right w:val="single" w:sz="4" w:space="0" w:color="E7DCCB"/>
-            </w:tcBorders>
-            <w:tcMar>
-              <w:top w:w="60" w:type="dxa"/>
-              <w:left w:w="80" w:type="dxa"/>
-              <w:bottom w:w="60" w:type="dxa"/>
-              <w:right w:w="80" w:type="dxa"/>
-            </w:tcMar>
-            <w:vAlign w:val="center"/>
-          </w:tcPr>
-          <w:p>
-            <w:pPr>
-              <w:spacing w:before="0" w:after="0" w:line="252" w:lineRule="auto"/>
-              <w:jc w:val="left"/>
-            </w:pPr>
-            <w:r/>
-            <w:r>
-              <w:rPr>
-                <w:rFonts w:ascii="Sylfaen" w:hAnsi="Sylfaen" w:cs="Sylfaen" w:eastAsia="Sylfaen"/>
-                <w:b w:val="0"/>
-                <w:i w:val="0"/>
-                <w:color w:val="1C2430"/>
-                <w:sz w:val="21"/>
-              </w:rPr>
-              <w:t>დაფაზე დარჩეს სამი სიტყვა: მამრავლი, მამრავლი, ნამრავლი. ერთმა მოსწავლემ 5·6 ასე წაიკითხოს.</w:t>
-            </w:r>
-          </w:p>
-        </w:tc>
-      </w:tr>
-      <w:tr>
-        <w:trPr>
-          <w:cantSplit/>
-        </w:trPr>
-        <w:tc>
-          <w:tcPr>
-            <w:tcW w:type="dxa" w:w="1191"/>
-            <w:shd w:val="clear" w:fill="FBF6EE"/>
-            <w:tcBorders>
-              <w:top w:val="single" w:sz="4" w:space="0" w:color="E7DCCB"/>
-              <w:left w:val="single" w:sz="4" w:space="0" w:color="E7DCCB"/>
-              <w:bottom w:val="single" w:sz="4" w:space="0" w:color="E7DCCB"/>
-              <w:right w:val="single" w:sz="4" w:space="0" w:color="E7DCCB"/>
-            </w:tcBorders>
-            <w:tcMar>
-              <w:top w:w="60" w:type="dxa"/>
-              <w:left w:w="80" w:type="dxa"/>
-              <w:bottom w:w="60" w:type="dxa"/>
-              <w:right w:w="80" w:type="dxa"/>
-            </w:tcMar>
-            <w:vAlign w:val="center"/>
-          </w:tcPr>
-          <w:p>
-            <w:pPr>
-              <w:spacing w:before="0" w:after="0" w:line="252" w:lineRule="auto"/>
-              <w:jc w:val="left"/>
-            </w:pPr>
-            <w:r/>
-            <w:r>
-              <w:rPr>
-                <w:rFonts w:ascii="Sylfaen" w:hAnsi="Sylfaen" w:cs="Sylfaen" w:eastAsia="Sylfaen"/>
-                <w:b/>
-                <w:i w:val="0"/>
-                <w:color w:val="1C2430"/>
-                <w:sz w:val="21"/>
-              </w:rPr>
-              <w:t>11 წთ</w:t>
-            </w:r>
-          </w:p>
-        </w:tc>
-        <w:tc>
-          <w:tcPr>
-            <w:tcW w:type="dxa" w:w="1757"/>
-            <w:shd w:val="clear" w:fill="FBF6EE"/>
-            <w:tcBorders>
-              <w:top w:val="single" w:sz="4" w:space="0" w:color="E7DCCB"/>
-              <w:left w:val="single" w:sz="4" w:space="0" w:color="E7DCCB"/>
-              <w:bottom w:val="single" w:sz="4" w:space="0" w:color="E7DCCB"/>
-              <w:right w:val="single" w:sz="4" w:space="0" w:color="E7DCCB"/>
-            </w:tcBorders>
-            <w:tcMar>
-              <w:top w:w="60" w:type="dxa"/>
-              <w:left w:w="80" w:type="dxa"/>
-              <w:bottom w:w="60" w:type="dxa"/>
-              <w:right w:w="80" w:type="dxa"/>
-            </w:tcMar>
-            <w:vAlign w:val="center"/>
-          </w:tcPr>
-          <w:p>
-            <w:pPr>
-              <w:spacing w:before="0" w:after="0" w:line="252" w:lineRule="auto"/>
-              <w:jc w:val="left"/>
-            </w:pPr>
-            <w:r/>
-            <w:r>
-              <w:rPr>
-                <w:rFonts w:ascii="Sylfaen" w:hAnsi="Sylfaen" w:cs="Sylfaen" w:eastAsia="Sylfaen"/>
-                <w:b/>
-                <w:i w:val="0"/>
-                <w:color w:val="1C2430"/>
-                <w:sz w:val="21"/>
-              </w:rPr>
-              <w:t>თვისებები</w:t>
-            </w:r>
-          </w:p>
-        </w:tc>
-        <w:tc>
-          <w:tcPr>
-            <w:tcW w:type="dxa" w:w="1247"/>
-            <w:shd w:val="clear" w:fill="FBF6EE"/>
-            <w:tcBorders>
-              <w:top w:val="single" w:sz="4" w:space="0" w:color="E7DCCB"/>
-              <w:left w:val="single" w:sz="4" w:space="0" w:color="E7DCCB"/>
-              <w:bottom w:val="single" w:sz="4" w:space="0" w:color="E7DCCB"/>
-              <w:right w:val="single" w:sz="4" w:space="0" w:color="E7DCCB"/>
-            </w:tcBorders>
-            <w:tcMar>
-              <w:top w:w="60" w:type="dxa"/>
-              <w:left w:w="80" w:type="dxa"/>
-              <w:bottom w:w="60" w:type="dxa"/>
-              <w:right w:w="80" w:type="dxa"/>
-            </w:tcMar>
-            <w:vAlign w:val="center"/>
-          </w:tcPr>
-          <w:p>
-            <w:pPr>
-              <w:spacing w:before="0" w:after="0" w:line="252" w:lineRule="auto"/>
-              <w:jc w:val="left"/>
-            </w:pPr>
-            <w:r/>
-            <w:r>
-              <w:rPr>
-                <w:rFonts w:ascii="Sylfaen" w:hAnsi="Sylfaen" w:cs="Sylfaen" w:eastAsia="Sylfaen"/>
-                <w:b/>
-                <w:i w:val="0"/>
-                <w:color w:val="1C2430"/>
-                <w:sz w:val="21"/>
-              </w:rPr>
-              <w:t>4–8</w:t>
-            </w:r>
-          </w:p>
-        </w:tc>
-        <w:tc>
-          <w:tcPr>
-            <w:tcW w:type="dxa" w:w="5783"/>
-            <w:shd w:val="clear" w:fill="FBF6EE"/>
-            <w:tcBorders>
-              <w:top w:val="single" w:sz="4" w:space="0" w:color="E7DCCB"/>
-              <w:left w:val="single" w:sz="4" w:space="0" w:color="E7DCCB"/>
-              <w:bottom w:val="single" w:sz="4" w:space="0" w:color="E7DCCB"/>
-              <w:right w:val="single" w:sz="4" w:space="0" w:color="E7DCCB"/>
-            </w:tcBorders>
-            <w:tcMar>
-              <w:top w:w="60" w:type="dxa"/>
-              <w:left w:w="80" w:type="dxa"/>
-              <w:bottom w:w="60" w:type="dxa"/>
-              <w:right w:w="80" w:type="dxa"/>
-            </w:tcMar>
-            <w:vAlign w:val="center"/>
-          </w:tcPr>
-          <w:p>
-            <w:pPr>
-              <w:spacing w:before="0" w:after="0" w:line="252" w:lineRule="auto"/>
-              <w:jc w:val="left"/>
-            </w:pPr>
-            <w:r/>
-            <w:r>
-              <w:rPr>
-                <w:rFonts w:ascii="Sylfaen" w:hAnsi="Sylfaen" w:cs="Sylfaen" w:eastAsia="Sylfaen"/>
-                <w:b w:val="0"/>
-                <w:i w:val="0"/>
-                <w:color w:val="1C2430"/>
-                <w:sz w:val="21"/>
-              </w:rPr>
-              <w:t>თითო სლაიდი ერთი აღმოჩენაა. გადანაცვლებაზე ორი მოსწავლე ადგილს იცვლის. ერთსა და ნულზე — პასუხი ხელის აწევით. განაწილება დღის მთავარია: 5·(9+4) ორივე გზით, მერე 9a+7a. ჯგუფების თვისება, თუ დრო იწურება, ერთ მაგალითად დატოვეთ.</w:t>
-            </w:r>
-          </w:p>
-        </w:tc>
-      </w:tr>
-      <w:tr>
-        <w:trPr>
-          <w:cantSplit/>
-        </w:trPr>
-        <w:tc>
-          <w:tcPr>
-            <w:tcW w:type="dxa" w:w="1191"/>
-            <w:shd w:val="clear" w:fill="FFFFFF"/>
-            <w:tcBorders>
-              <w:top w:val="single" w:sz="4" w:space="0" w:color="E7DCCB"/>
-              <w:left w:val="single" w:sz="4" w:space="0" w:color="E7DCCB"/>
-              <w:bottom w:val="single" w:sz="4" w:space="0" w:color="E7DCCB"/>
-              <w:right w:val="single" w:sz="4" w:space="0" w:color="E7DCCB"/>
-            </w:tcBorders>
-            <w:tcMar>
-              <w:top w:w="60" w:type="dxa"/>
-              <w:left w:w="80" w:type="dxa"/>
-              <w:bottom w:w="60" w:type="dxa"/>
-              <w:right w:w="80" w:type="dxa"/>
-            </w:tcMar>
-            <w:vAlign w:val="center"/>
-          </w:tcPr>
-          <w:p>
-            <w:pPr>
-              <w:spacing w:before="0" w:after="0" w:line="252" w:lineRule="auto"/>
-              <w:jc w:val="left"/>
-            </w:pPr>
-            <w:r/>
-            <w:r>
-              <w:rPr>
-                <w:rFonts w:ascii="Sylfaen" w:hAnsi="Sylfaen" w:cs="Sylfaen" w:eastAsia="Sylfaen"/>
-                <w:b/>
-                <w:i w:val="0"/>
-                <w:color w:val="1C2430"/>
-                <w:sz w:val="21"/>
-              </w:rPr>
-              <w:t>8 წთ</w:t>
-            </w:r>
-          </w:p>
-        </w:tc>
-        <w:tc>
-          <w:tcPr>
-            <w:tcW w:type="dxa" w:w="1757"/>
-            <w:shd w:val="clear" w:fill="FFFFFF"/>
-            <w:tcBorders>
-              <w:top w:val="single" w:sz="4" w:space="0" w:color="E7DCCB"/>
-              <w:left w:val="single" w:sz="4" w:space="0" w:color="E7DCCB"/>
-              <w:bottom w:val="single" w:sz="4" w:space="0" w:color="E7DCCB"/>
-              <w:right w:val="single" w:sz="4" w:space="0" w:color="E7DCCB"/>
-            </w:tcBorders>
-            <w:tcMar>
-              <w:top w:w="60" w:type="dxa"/>
-              <w:left w:w="80" w:type="dxa"/>
-              <w:bottom w:w="60" w:type="dxa"/>
-              <w:right w:w="80" w:type="dxa"/>
-            </w:tcMar>
-            <w:vAlign w:val="center"/>
-          </w:tcPr>
-          <w:p>
-            <w:pPr>
-              <w:spacing w:before="0" w:after="0" w:line="252" w:lineRule="auto"/>
-              <w:jc w:val="left"/>
-            </w:pPr>
-            <w:r/>
-            <w:r>
-              <w:rPr>
-                <w:rFonts w:ascii="Sylfaen" w:hAnsi="Sylfaen" w:cs="Sylfaen" w:eastAsia="Sylfaen"/>
-                <w:b/>
-                <w:i w:val="0"/>
-                <w:color w:val="1C2430"/>
-                <w:sz w:val="21"/>
-              </w:rPr>
-              <w:t>ნულების ხრიკი</w:t>
-            </w:r>
-          </w:p>
-        </w:tc>
-        <w:tc>
-          <w:tcPr>
-            <w:tcW w:type="dxa" w:w="1247"/>
-            <w:shd w:val="clear" w:fill="FFFFFF"/>
-            <w:tcBorders>
-              <w:top w:val="single" w:sz="4" w:space="0" w:color="E7DCCB"/>
-              <w:left w:val="single" w:sz="4" w:space="0" w:color="E7DCCB"/>
-              <w:bottom w:val="single" w:sz="4" w:space="0" w:color="E7DCCB"/>
-              <w:right w:val="single" w:sz="4" w:space="0" w:color="E7DCCB"/>
-            </w:tcBorders>
-            <w:tcMar>
-              <w:top w:w="60" w:type="dxa"/>
-              <w:left w:w="80" w:type="dxa"/>
-              <w:bottom w:w="60" w:type="dxa"/>
-              <w:right w:w="80" w:type="dxa"/>
-            </w:tcMar>
-            <w:vAlign w:val="center"/>
-          </w:tcPr>
-          <w:p>
-            <w:pPr>
-              <w:spacing w:before="0" w:after="0" w:line="252" w:lineRule="auto"/>
-              <w:jc w:val="left"/>
-            </w:pPr>
-            <w:r/>
-            <w:r>
-              <w:rPr>
-                <w:rFonts w:ascii="Sylfaen" w:hAnsi="Sylfaen" w:cs="Sylfaen" w:eastAsia="Sylfaen"/>
-                <w:b/>
-                <w:i w:val="0"/>
-                <w:color w:val="1C2430"/>
-                <w:sz w:val="21"/>
-              </w:rPr>
-              <w:t>9–11</w:t>
-            </w:r>
-          </w:p>
-        </w:tc>
-        <w:tc>
-          <w:tcPr>
-            <w:tcW w:type="dxa" w:w="5783"/>
-            <w:shd w:val="clear" w:fill="FFFFFF"/>
-            <w:tcBorders>
-              <w:top w:val="single" w:sz="4" w:space="0" w:color="E7DCCB"/>
-              <w:left w:val="single" w:sz="4" w:space="0" w:color="E7DCCB"/>
-              <w:bottom w:val="single" w:sz="4" w:space="0" w:color="E7DCCB"/>
-              <w:right w:val="single" w:sz="4" w:space="0" w:color="E7DCCB"/>
-            </w:tcBorders>
-            <w:tcMar>
-              <w:top w:w="60" w:type="dxa"/>
-              <w:left w:w="80" w:type="dxa"/>
-              <w:bottom w:w="60" w:type="dxa"/>
-              <w:right w:w="80" w:type="dxa"/>
-            </w:tcMar>
-            <w:vAlign w:val="center"/>
-          </w:tcPr>
-          <w:p>
-            <w:pPr>
-              <w:spacing w:before="0" w:after="0" w:line="252" w:lineRule="auto"/>
-              <w:jc w:val="left"/>
-            </w:pPr>
-            <w:r/>
-            <w:r>
-              <w:rPr>
-                <w:rFonts w:ascii="Sylfaen" w:hAnsi="Sylfaen" w:cs="Sylfaen" w:eastAsia="Sylfaen"/>
-                <w:b w:val="0"/>
-                <w:i w:val="0"/>
-                <w:color w:val="1C2430"/>
-                <w:sz w:val="21"/>
-              </w:rPr>
-              <w:t>კიბე: 8·10, 8·100… ნული ბოლოში გადმოდის. მერე 50·30 — ჯერ 5·3=15, მერე ორი ნული. სლაიდ 11-ის პასუხი დახურულია, სანამ კლასი არ იტყვის ნულების რაოდენობას.</w:t>
-            </w:r>
-          </w:p>
-        </w:tc>
-      </w:tr>
-      <w:tr>
-        <w:trPr>
-          <w:cantSplit/>
-        </w:trPr>
-        <w:tc>
-          <w:tcPr>
-            <w:tcW w:type="dxa" w:w="1191"/>
-            <w:shd w:val="clear" w:fill="FBF6EE"/>
-            <w:tcBorders>
-              <w:top w:val="single" w:sz="4" w:space="0" w:color="E7DCCB"/>
-              <w:left w:val="single" w:sz="4" w:space="0" w:color="E7DCCB"/>
-              <w:bottom w:val="single" w:sz="4" w:space="0" w:color="E7DCCB"/>
-              <w:right w:val="single" w:sz="4" w:space="0" w:color="E7DCCB"/>
-            </w:tcBorders>
-            <w:tcMar>
-              <w:top w:w="60" w:type="dxa"/>
-              <w:left w:w="80" w:type="dxa"/>
-              <w:bottom w:w="60" w:type="dxa"/>
-              <w:right w:w="80" w:type="dxa"/>
-            </w:tcMar>
-            <w:vAlign w:val="center"/>
-          </w:tcPr>
-          <w:p>
-            <w:pPr>
-              <w:spacing w:before="0" w:after="0" w:line="252" w:lineRule="auto"/>
-              <w:jc w:val="left"/>
-            </w:pPr>
-            <w:r/>
-            <w:r>
-              <w:rPr>
-                <w:rFonts w:ascii="Sylfaen" w:hAnsi="Sylfaen" w:cs="Sylfaen" w:eastAsia="Sylfaen"/>
-                <w:b/>
-                <w:i w:val="0"/>
-                <w:color w:val="1C2430"/>
-                <w:sz w:val="21"/>
-              </w:rPr>
-              <w:t>8 წთ</w:t>
-            </w:r>
-          </w:p>
-        </w:tc>
-        <w:tc>
-          <w:tcPr>
-            <w:tcW w:type="dxa" w:w="1757"/>
-            <w:shd w:val="clear" w:fill="FBF6EE"/>
-            <w:tcBorders>
-              <w:top w:val="single" w:sz="4" w:space="0" w:color="E7DCCB"/>
-              <w:left w:val="single" w:sz="4" w:space="0" w:color="E7DCCB"/>
-              <w:bottom w:val="single" w:sz="4" w:space="0" w:color="E7DCCB"/>
-              <w:right w:val="single" w:sz="4" w:space="0" w:color="E7DCCB"/>
-            </w:tcBorders>
-            <w:tcMar>
-              <w:top w:w="60" w:type="dxa"/>
-              <w:left w:w="80" w:type="dxa"/>
-              <w:bottom w:w="60" w:type="dxa"/>
-              <w:right w:w="80" w:type="dxa"/>
-            </w:tcMar>
-            <w:vAlign w:val="center"/>
-          </w:tcPr>
-          <w:p>
-            <w:pPr>
-              <w:spacing w:before="0" w:after="0" w:line="252" w:lineRule="auto"/>
-              <w:jc w:val="left"/>
-            </w:pPr>
-            <w:r/>
-            <w:r>
-              <w:rPr>
-                <w:rFonts w:ascii="Sylfaen" w:hAnsi="Sylfaen" w:cs="Sylfaen" w:eastAsia="Sylfaen"/>
-                <w:b/>
-                <w:i w:val="0"/>
-                <w:color w:val="1C2430"/>
-                <w:sz w:val="21"/>
-              </w:rPr>
-              <w:t>სწორი კარი</w:t>
-            </w:r>
-          </w:p>
-        </w:tc>
-        <w:tc>
-          <w:tcPr>
-            <w:tcW w:type="dxa" w:w="1247"/>
-            <w:shd w:val="clear" w:fill="FBF6EE"/>
-            <w:tcBorders>
-              <w:top w:val="single" w:sz="4" w:space="0" w:color="E7DCCB"/>
-              <w:left w:val="single" w:sz="4" w:space="0" w:color="E7DCCB"/>
-              <w:bottom w:val="single" w:sz="4" w:space="0" w:color="E7DCCB"/>
-              <w:right w:val="single" w:sz="4" w:space="0" w:color="E7DCCB"/>
-            </w:tcBorders>
-            <w:tcMar>
-              <w:top w:w="60" w:type="dxa"/>
-              <w:left w:w="80" w:type="dxa"/>
-              <w:bottom w:w="60" w:type="dxa"/>
-              <w:right w:w="80" w:type="dxa"/>
-            </w:tcMar>
-            <w:vAlign w:val="center"/>
-          </w:tcPr>
-          <w:p>
-            <w:pPr>
-              <w:spacing w:before="0" w:after="0" w:line="252" w:lineRule="auto"/>
-              <w:jc w:val="left"/>
-            </w:pPr>
-            <w:r/>
-            <w:r>
-              <w:rPr>
-                <w:rFonts w:ascii="Sylfaen" w:hAnsi="Sylfaen" w:cs="Sylfaen" w:eastAsia="Sylfaen"/>
-                <w:b/>
-                <w:i w:val="0"/>
-                <w:color w:val="1C2430"/>
-                <w:sz w:val="21"/>
-              </w:rPr>
-              <w:t>12</w:t>
-            </w:r>
-          </w:p>
-        </w:tc>
-        <w:tc>
-          <w:tcPr>
-            <w:tcW w:type="dxa" w:w="5783"/>
-            <w:shd w:val="clear" w:fill="FBF6EE"/>
-            <w:tcBorders>
-              <w:top w:val="single" w:sz="4" w:space="0" w:color="E7DCCB"/>
-              <w:left w:val="single" w:sz="4" w:space="0" w:color="E7DCCB"/>
-              <w:bottom w:val="single" w:sz="4" w:space="0" w:color="E7DCCB"/>
-              <w:right w:val="single" w:sz="4" w:space="0" w:color="E7DCCB"/>
-            </w:tcBorders>
-            <w:tcMar>
-              <w:top w:w="60" w:type="dxa"/>
-              <w:left w:w="80" w:type="dxa"/>
-              <w:bottom w:w="60" w:type="dxa"/>
-              <w:right w:w="80" w:type="dxa"/>
-            </w:tcMar>
-            <w:vAlign w:val="center"/>
-          </w:tcPr>
-          <w:p>
-            <w:pPr>
-              <w:spacing w:before="0" w:after="0" w:line="252" w:lineRule="auto"/>
-              <w:jc w:val="left"/>
-            </w:pPr>
-            <w:r/>
-            <w:r>
-              <w:rPr>
-                <w:rFonts w:ascii="Sylfaen" w:hAnsi="Sylfaen" w:cs="Sylfaen" w:eastAsia="Sylfaen"/>
-                <w:b w:val="0"/>
-                <w:i w:val="0"/>
-                <w:color w:val="1C2430"/>
-                <w:sz w:val="21"/>
-              </w:rPr>
-              <w:t>ოთხი კითხვა სახელმძღვანელოდან. სწორი კარი მწვანდება. ქულა არ იწერება — გვაინტერესებს, ვინ ხსნის, რატომ დაამატა სწორედ ამდენი ნული.</w:t>
-            </w:r>
-          </w:p>
-        </w:tc>
-      </w:tr>
-      <w:tr>
-        <w:trPr>
-          <w:cantSplit/>
-        </w:trPr>
-        <w:tc>
-          <w:tcPr>
-            <w:tcW w:type="dxa" w:w="1191"/>
-            <w:shd w:val="clear" w:fill="FFFFFF"/>
-            <w:tcBorders>
-              <w:top w:val="single" w:sz="4" w:space="0" w:color="E7DCCB"/>
-              <w:left w:val="single" w:sz="4" w:space="0" w:color="E7DCCB"/>
-              <w:bottom w:val="single" w:sz="4" w:space="0" w:color="E7DCCB"/>
-              <w:right w:val="single" w:sz="4" w:space="0" w:color="E7DCCB"/>
-            </w:tcBorders>
-            <w:tcMar>
-              <w:top w:w="60" w:type="dxa"/>
-              <w:left w:w="80" w:type="dxa"/>
-              <w:bottom w:w="60" w:type="dxa"/>
-              <w:right w:w="80" w:type="dxa"/>
-            </w:tcMar>
-            <w:vAlign w:val="center"/>
-          </w:tcPr>
-          <w:p>
-            <w:pPr>
-              <w:spacing w:before="0" w:after="0" w:line="252" w:lineRule="auto"/>
-              <w:jc w:val="left"/>
-            </w:pPr>
-            <w:r/>
-            <w:r>
-              <w:rPr>
-                <w:rFonts w:ascii="Sylfaen" w:hAnsi="Sylfaen" w:cs="Sylfaen" w:eastAsia="Sylfaen"/>
-                <w:b/>
-                <w:i w:val="0"/>
-                <w:color w:val="1C2430"/>
-                <w:sz w:val="21"/>
-              </w:rPr>
-              <w:t>4 წთ</w:t>
-            </w:r>
-          </w:p>
-        </w:tc>
-        <w:tc>
-          <w:tcPr>
-            <w:tcW w:type="dxa" w:w="1757"/>
-            <w:shd w:val="clear" w:fill="FFFFFF"/>
-            <w:tcBorders>
-              <w:top w:val="single" w:sz="4" w:space="0" w:color="E7DCCB"/>
-              <w:left w:val="single" w:sz="4" w:space="0" w:color="E7DCCB"/>
-              <w:bottom w:val="single" w:sz="4" w:space="0" w:color="E7DCCB"/>
-              <w:right w:val="single" w:sz="4" w:space="0" w:color="E7DCCB"/>
-            </w:tcBorders>
-            <w:tcMar>
-              <w:top w:w="60" w:type="dxa"/>
-              <w:left w:w="80" w:type="dxa"/>
-              <w:bottom w:w="60" w:type="dxa"/>
-              <w:right w:w="80" w:type="dxa"/>
-            </w:tcMar>
-            <w:vAlign w:val="center"/>
-          </w:tcPr>
-          <w:p>
-            <w:pPr>
-              <w:spacing w:before="0" w:after="0" w:line="252" w:lineRule="auto"/>
-              <w:jc w:val="left"/>
-            </w:pPr>
-            <w:r/>
-            <w:r>
-              <w:rPr>
-                <w:rFonts w:ascii="Sylfaen" w:hAnsi="Sylfaen" w:cs="Sylfaen" w:eastAsia="Sylfaen"/>
-                <w:b/>
-                <w:i w:val="0"/>
-                <w:color w:val="1C2430"/>
-                <w:sz w:val="21"/>
-              </w:rPr>
-              <w:t>ქარხანა</w:t>
-            </w:r>
-          </w:p>
-        </w:tc>
-        <w:tc>
-          <w:tcPr>
-            <w:tcW w:type="dxa" w:w="1247"/>
-            <w:shd w:val="clear" w:fill="FFFFFF"/>
-            <w:tcBorders>
-              <w:top w:val="single" w:sz="4" w:space="0" w:color="E7DCCB"/>
-              <w:left w:val="single" w:sz="4" w:space="0" w:color="E7DCCB"/>
-              <w:bottom w:val="single" w:sz="4" w:space="0" w:color="E7DCCB"/>
-              <w:right w:val="single" w:sz="4" w:space="0" w:color="E7DCCB"/>
-            </w:tcBorders>
-            <w:tcMar>
-              <w:top w:w="60" w:type="dxa"/>
-              <w:left w:w="80" w:type="dxa"/>
-              <w:bottom w:w="60" w:type="dxa"/>
-              <w:right w:w="80" w:type="dxa"/>
-            </w:tcMar>
-            <w:vAlign w:val="center"/>
-          </w:tcPr>
-          <w:p>
-            <w:pPr>
-              <w:spacing w:before="0" w:after="0" w:line="252" w:lineRule="auto"/>
-              <w:jc w:val="left"/>
-            </w:pPr>
-            <w:r/>
-            <w:r>
-              <w:rPr>
-                <w:rFonts w:ascii="Sylfaen" w:hAnsi="Sylfaen" w:cs="Sylfaen" w:eastAsia="Sylfaen"/>
-                <w:b/>
-                <w:i w:val="0"/>
-                <w:color w:val="1C2430"/>
-                <w:sz w:val="21"/>
-              </w:rPr>
-              <w:t>13</w:t>
-            </w:r>
-          </w:p>
-        </w:tc>
-        <w:tc>
-          <w:tcPr>
-            <w:tcW w:type="dxa" w:w="5783"/>
-            <w:shd w:val="clear" w:fill="FFFFFF"/>
-            <w:tcBorders>
-              <w:top w:val="single" w:sz="4" w:space="0" w:color="E7DCCB"/>
-              <w:left w:val="single" w:sz="4" w:space="0" w:color="E7DCCB"/>
-              <w:bottom w:val="single" w:sz="4" w:space="0" w:color="E7DCCB"/>
-              <w:right w:val="single" w:sz="4" w:space="0" w:color="E7DCCB"/>
-            </w:tcBorders>
-            <w:tcMar>
-              <w:top w:w="60" w:type="dxa"/>
-              <w:left w:w="80" w:type="dxa"/>
-              <w:bottom w:w="60" w:type="dxa"/>
-              <w:right w:w="80" w:type="dxa"/>
-            </w:tcMar>
-            <w:vAlign w:val="center"/>
-          </w:tcPr>
-          <w:p>
-            <w:pPr>
-              <w:spacing w:before="0" w:after="0" w:line="252" w:lineRule="auto"/>
-              <w:jc w:val="left"/>
-            </w:pPr>
-            <w:r/>
-            <w:r>
-              <w:rPr>
-                <w:rFonts w:ascii="Sylfaen" w:hAnsi="Sylfaen" w:cs="Sylfaen" w:eastAsia="Sylfaen"/>
-                <w:b w:val="0"/>
-                <w:i w:val="0"/>
-                <w:color w:val="1C2430"/>
-                <w:sz w:val="21"/>
-              </w:rPr>
-              <w:t>წვენის ქარხანა, გვ. 64: 18·26 700 მეტია 626 000-ზე თუ ნაკლები? ჯერ კლასი ამრგვალებს, მერე იხსნება 20·30 000=600 000. ორივე რიცხვი ავწიეთ, ამიტომ ნამდვილი ნამრავლი კიდევ უფრო მცირეა.</w:t>
-            </w:r>
-          </w:p>
-        </w:tc>
-      </w:tr>
-      <w:tr>
-        <w:trPr>
-          <w:cantSplit/>
-        </w:trPr>
-        <w:tc>
-          <w:tcPr>
-            <w:tcW w:type="dxa" w:w="1191"/>
-            <w:shd w:val="clear" w:fill="FBF6EE"/>
-            <w:tcBorders>
-              <w:top w:val="single" w:sz="4" w:space="0" w:color="E7DCCB"/>
-              <w:left w:val="single" w:sz="4" w:space="0" w:color="E7DCCB"/>
-              <w:bottom w:val="single" w:sz="4" w:space="0" w:color="E7DCCB"/>
-              <w:right w:val="single" w:sz="4" w:space="0" w:color="E7DCCB"/>
-            </w:tcBorders>
-            <w:tcMar>
-              <w:top w:w="60" w:type="dxa"/>
-              <w:left w:w="80" w:type="dxa"/>
-              <w:bottom w:w="60" w:type="dxa"/>
-              <w:right w:w="80" w:type="dxa"/>
-            </w:tcMar>
-            <w:vAlign w:val="center"/>
-          </w:tcPr>
-          <w:p>
-            <w:pPr>
-              <w:spacing w:before="0" w:after="0" w:line="252" w:lineRule="auto"/>
-              <w:jc w:val="left"/>
-            </w:pPr>
-            <w:r/>
-            <w:r>
-              <w:rPr>
-                <w:rFonts w:ascii="Sylfaen" w:hAnsi="Sylfaen" w:cs="Sylfaen" w:eastAsia="Sylfaen"/>
-                <w:b/>
-                <w:i w:val="0"/>
-                <w:color w:val="1C2430"/>
-                <w:sz w:val="21"/>
-              </w:rPr>
-              <w:t>2 წთ</w:t>
-            </w:r>
-          </w:p>
-        </w:tc>
-        <w:tc>
-          <w:tcPr>
-            <w:tcW w:type="dxa" w:w="1757"/>
-            <w:shd w:val="clear" w:fill="FBF6EE"/>
-            <w:tcBorders>
-              <w:top w:val="single" w:sz="4" w:space="0" w:color="E7DCCB"/>
-              <w:left w:val="single" w:sz="4" w:space="0" w:color="E7DCCB"/>
-              <w:bottom w:val="single" w:sz="4" w:space="0" w:color="E7DCCB"/>
-              <w:right w:val="single" w:sz="4" w:space="0" w:color="E7DCCB"/>
-            </w:tcBorders>
-            <w:tcMar>
-              <w:top w:w="60" w:type="dxa"/>
-              <w:left w:w="80" w:type="dxa"/>
-              <w:bottom w:w="60" w:type="dxa"/>
-              <w:right w:w="80" w:type="dxa"/>
-            </w:tcMar>
-            <w:vAlign w:val="center"/>
-          </w:tcPr>
-          <w:p>
-            <w:pPr>
-              <w:spacing w:before="0" w:after="0" w:line="252" w:lineRule="auto"/>
-              <w:jc w:val="left"/>
-            </w:pPr>
-            <w:r/>
-            <w:r>
-              <w:rPr>
-                <w:rFonts w:ascii="Sylfaen" w:hAnsi="Sylfaen" w:cs="Sylfaen" w:eastAsia="Sylfaen"/>
-                <w:b/>
-                <w:i w:val="0"/>
-                <w:color w:val="1C2430"/>
-                <w:sz w:val="21"/>
-              </w:rPr>
-              <w:t>დახურვა</w:t>
-            </w:r>
-          </w:p>
-        </w:tc>
-        <w:tc>
-          <w:tcPr>
-            <w:tcW w:type="dxa" w:w="1247"/>
-            <w:shd w:val="clear" w:fill="FBF6EE"/>
-            <w:tcBorders>
-              <w:top w:val="single" w:sz="4" w:space="0" w:color="E7DCCB"/>
-              <w:left w:val="single" w:sz="4" w:space="0" w:color="E7DCCB"/>
-              <w:bottom w:val="single" w:sz="4" w:space="0" w:color="E7DCCB"/>
-              <w:right w:val="single" w:sz="4" w:space="0" w:color="E7DCCB"/>
-            </w:tcBorders>
-            <w:tcMar>
-              <w:top w:w="60" w:type="dxa"/>
-              <w:left w:w="80" w:type="dxa"/>
-              <w:bottom w:w="60" w:type="dxa"/>
-              <w:right w:w="80" w:type="dxa"/>
-            </w:tcMar>
-            <w:vAlign w:val="center"/>
-          </w:tcPr>
-          <w:p>
-            <w:pPr>
-              <w:spacing w:before="0" w:after="0" w:line="252" w:lineRule="auto"/>
-              <w:jc w:val="left"/>
-            </w:pPr>
-            <w:r/>
-            <w:r>
-              <w:rPr>
-                <w:rFonts w:ascii="Sylfaen" w:hAnsi="Sylfaen" w:cs="Sylfaen" w:eastAsia="Sylfaen"/>
-                <w:b/>
-                <w:i w:val="0"/>
-                <w:color w:val="1C2430"/>
-                <w:sz w:val="21"/>
-              </w:rPr>
-              <w:t>14–15</w:t>
-            </w:r>
-          </w:p>
-        </w:tc>
-        <w:tc>
-          <w:tcPr>
-            <w:tcW w:type="dxa" w:w="5783"/>
-            <w:shd w:val="clear" w:fill="FBF6EE"/>
-            <w:tcBorders>
-              <w:top w:val="single" w:sz="4" w:space="0" w:color="E7DCCB"/>
-              <w:left w:val="single" w:sz="4" w:space="0" w:color="E7DCCB"/>
-              <w:bottom w:val="single" w:sz="4" w:space="0" w:color="E7DCCB"/>
-              <w:right w:val="single" w:sz="4" w:space="0" w:color="E7DCCB"/>
-            </w:tcBorders>
-            <w:tcMar>
-              <w:top w:w="60" w:type="dxa"/>
-              <w:left w:w="80" w:type="dxa"/>
-              <w:bottom w:w="60" w:type="dxa"/>
-              <w:right w:w="80" w:type="dxa"/>
-            </w:tcMar>
-            <w:vAlign w:val="center"/>
-          </w:tcPr>
-          <w:p>
-            <w:pPr>
-              <w:spacing w:before="0" w:after="0" w:line="252" w:lineRule="auto"/>
-              <w:jc w:val="left"/>
-            </w:pPr>
-            <w:r/>
-            <w:r>
-              <w:rPr>
-                <w:rFonts w:ascii="Sylfaen" w:hAnsi="Sylfaen" w:cs="Sylfaen" w:eastAsia="Sylfaen"/>
-                <w:b w:val="0"/>
-                <w:i w:val="0"/>
-                <w:color w:val="1C2430"/>
-                <w:sz w:val="21"/>
-              </w:rPr>
-              <w:t>სამი სიტყვა ერთად: თვისება, ნული, დაახლოებით. ერთი წინადადება „დღეს ვისწავლე…“. საშინაო სლაიდზე რჩება ზარამდე.</w:t>
-            </w:r>
-          </w:p>
-        </w:tc>
-      </w:tr>
-    </w:tbl>
     <w:p>
       <w:pPr>
-        <w:spacing w:before="160" w:after="40" w:line="252" w:lineRule="auto"/>
-      </w:pPr>
-      <w:r>
-        <w:rPr>
-          <w:rFonts w:ascii="Sylfaen" w:hAnsi="Sylfaen" w:cs="Sylfaen" w:eastAsia="Sylfaen"/>
-          <w:b/>
-          <w:i w:val="0"/>
-          <w:color w:val="1C2430"/>
-          <w:sz w:val="22"/>
-        </w:rPr>
-        <w:t xml:space="preserve">თუ დრო იწურება: </w:t>
-      </w:r>
-      <w:r>
-        <w:rPr>
-          <w:rFonts w:ascii="Sylfaen" w:hAnsi="Sylfaen" w:cs="Sylfaen" w:eastAsia="Sylfaen"/>
-          <w:b w:val="0"/>
-          <w:i w:val="0"/>
-          <w:color w:val="1C2430"/>
-          <w:sz w:val="22"/>
-        </w:rPr>
-        <w:t>გამოტოვეთ სლაიდი 6 (ჯგუფების თვისება). ქარხანა დატოვეთ — ის არის დღის დასამახსოვრებელი ბოლო.</w:t>
-      </w:r>
-    </w:p>
-    <w:p>
-      <w:pPr>
-        <w:spacing w:before="0" w:after="40" w:line="252" w:lineRule="auto"/>
-      </w:pPr>
-      <w:r>
-        <w:rPr>
-          <w:rFonts w:ascii="Sylfaen" w:hAnsi="Sylfaen" w:cs="Sylfaen" w:eastAsia="Sylfaen"/>
-          <w:b/>
-          <w:i w:val="0"/>
-          <w:color w:val="1C2430"/>
-          <w:sz w:val="22"/>
-        </w:rPr>
-        <w:t xml:space="preserve">თუ დრო დარჩა: </w:t>
-      </w:r>
-      <w:r>
-        <w:rPr>
-          <w:rFonts w:ascii="Sylfaen" w:hAnsi="Sylfaen" w:cs="Sylfaen" w:eastAsia="Sylfaen"/>
-          <w:b w:val="0"/>
-          <w:i w:val="0"/>
-          <w:color w:val="1C2430"/>
-          <w:sz w:val="22"/>
-        </w:rPr>
-        <w:t>სლაიდ 13-ის მეორე ღილაკი — 238·41 ≈ 200·40 = 8 000. ორივე რიცხვი დაკლებულია, ამიტომ ნამდვილი ნამრავლი მეტია.</w:t>
-      </w:r>
-    </w:p>
-    <w:p>
-      <w:pPr>
-        <w:spacing w:before="240" w:after="80" w:line="259" w:lineRule="auto"/>
-      </w:pPr>
-      <w:r>
-        <w:rPr>
-          <w:rFonts w:ascii="Sylfaen" w:hAnsi="Sylfaen" w:cs="Sylfaen" w:eastAsia="Sylfaen"/>
-          <w:b/>
-          <w:i w:val="0"/>
-          <w:color w:val="8E2F3C"/>
-          <w:sz w:val="28"/>
-        </w:rPr>
-        <w:t>ორი ტემპი</w:t>
-      </w:r>
-    </w:p>
-    <w:tbl>
-      <w:tblPr>
-        <w:tblW w:type="pct" w:w="5000"/>
-        <w:tblLook w:firstColumn="1" w:firstRow="1" w:lastColumn="0" w:lastRow="0" w:noHBand="0" w:noVBand="1" w:val="04A0"/>
-        <w:tblBorders>
-          <w:top w:val="nil"/>
-          <w:left w:val="nil"/>
-          <w:bottom w:val="nil"/>
-          <w:right w:val="nil"/>
-          <w:insideH w:val="nil"/>
-          <w:insideV w:val="nil"/>
-        </w:tblBorders>
-      </w:tblPr>
-      <w:tblGrid>
-        <w:gridCol w:w="5103"/>
-        <w:gridCol w:w="5103"/>
-      </w:tblGrid>
-      <w:tr>
-        <w:tc>
-          <w:tcPr>
-            <w:tcW w:type="dxa" w:w="5103"/>
-            <w:shd w:val="clear" w:fill="FFF8E8"/>
-            <w:tcBorders>
-              <w:top w:val="single" w:sz="4" w:space="0" w:color="E7DCCB"/>
-              <w:left w:val="single" w:sz="4" w:space="0" w:color="E7DCCB"/>
-              <w:bottom w:val="single" w:sz="4" w:space="0" w:color="E7DCCB"/>
-              <w:right w:val="single" w:sz="4" w:space="0" w:color="E7DCCB"/>
-            </w:tcBorders>
-            <w:tcMar>
-              <w:top w:w="80" w:type="dxa"/>
-              <w:left w:w="100" w:type="dxa"/>
-              <w:bottom w:w="80" w:type="dxa"/>
-              <w:right w:w="100" w:type="dxa"/>
-            </w:tcMar>
-            <w:vAlign w:val="top"/>
-          </w:tcPr>
-          <w:p>
-            <w:pPr>
-              <w:spacing w:before="0" w:after="40" w:line="259" w:lineRule="auto"/>
-            </w:pPr>
-            <w:r/>
-            <w:r>
-              <w:rPr>
-                <w:rFonts w:ascii="Sylfaen" w:hAnsi="Sylfaen" w:cs="Sylfaen" w:eastAsia="Sylfaen"/>
-                <w:b/>
-                <w:i w:val="0"/>
-                <w:color w:val="8E2F3C"/>
-                <w:sz w:val="24"/>
-              </w:rPr>
-              <w:t>მეტი მხარდაჭერა</w:t>
-            </w:r>
-          </w:p>
-          <w:p>
-            <w:pPr>
-              <w:spacing w:before="20" w:after="20" w:line="252" w:lineRule="auto"/>
-            </w:pPr>
-            <w:r>
-              <w:rPr>
-                <w:rFonts w:ascii="Sylfaen" w:hAnsi="Sylfaen" w:cs="Sylfaen" w:eastAsia="Sylfaen"/>
-                <w:b w:val="0"/>
-                <w:i w:val="0"/>
-                <w:color w:val="1C2430"/>
-                <w:sz w:val="22"/>
-              </w:rPr>
-              <w:t>ნულებს ფანქრით შემოხაზავენ და მხოლოდ დარჩენილ ციფრებს ამრავლებენ.</w:t>
-            </w:r>
-          </w:p>
-          <w:p>
-            <w:pPr>
-              <w:spacing w:before="20" w:after="20" w:line="252" w:lineRule="auto"/>
-            </w:pPr>
-            <w:r>
-              <w:rPr>
-                <w:rFonts w:ascii="Sylfaen" w:hAnsi="Sylfaen" w:cs="Sylfaen" w:eastAsia="Sylfaen"/>
-                <w:b w:val="0"/>
-                <w:i w:val="0"/>
-                <w:color w:val="1C2430"/>
-                <w:sz w:val="22"/>
-              </w:rPr>
-              <w:t>50·30-ს წყვილში შლიან: 5·3, მერე ნულები.</w:t>
-            </w:r>
-          </w:p>
-          <w:p>
-            <w:pPr>
-              <w:spacing w:before="20" w:after="20" w:line="252" w:lineRule="auto"/>
-            </w:pPr>
-            <w:r>
-              <w:rPr>
-                <w:rFonts w:ascii="Sylfaen" w:hAnsi="Sylfaen" w:cs="Sylfaen" w:eastAsia="Sylfaen"/>
-                <w:b w:val="0"/>
-                <w:i w:val="0"/>
-                <w:color w:val="1C2430"/>
-                <w:sz w:val="22"/>
-              </w:rPr>
-              <w:t>სლაიდ 11-ზე საკმარისია პირველი მაგალითი.</w:t>
-            </w:r>
-          </w:p>
-        </w:tc>
-        <w:tc>
-          <w:tcPr>
-            <w:tcW w:type="dxa" w:w="5103"/>
-            <w:shd w:val="clear" w:fill="F3FAF7"/>
-            <w:tcBorders>
-              <w:top w:val="single" w:sz="4" w:space="0" w:color="E7DCCB"/>
-              <w:left w:val="single" w:sz="4" w:space="0" w:color="E7DCCB"/>
-              <w:bottom w:val="single" w:sz="4" w:space="0" w:color="E7DCCB"/>
-              <w:right w:val="single" w:sz="4" w:space="0" w:color="E7DCCB"/>
-            </w:tcBorders>
-            <w:tcMar>
-              <w:top w:w="80" w:type="dxa"/>
-              <w:left w:w="100" w:type="dxa"/>
-              <w:bottom w:w="80" w:type="dxa"/>
-              <w:right w:w="100" w:type="dxa"/>
-            </w:tcMar>
-            <w:vAlign w:val="top"/>
-          </w:tcPr>
-          <w:p>
-            <w:pPr>
-              <w:spacing w:before="0" w:after="40" w:line="259" w:lineRule="auto"/>
-            </w:pPr>
-            <w:r/>
-            <w:r>
-              <w:rPr>
-                <w:rFonts w:ascii="Sylfaen" w:hAnsi="Sylfaen" w:cs="Sylfaen" w:eastAsia="Sylfaen"/>
-                <w:b/>
-                <w:i w:val="0"/>
-                <w:color w:val="8E2F3C"/>
-                <w:sz w:val="24"/>
-              </w:rPr>
-              <w:t>მეტი გამოწვევა</w:t>
-            </w:r>
-          </w:p>
-          <w:p>
-            <w:pPr>
-              <w:spacing w:before="20" w:after="20" w:line="252" w:lineRule="auto"/>
-            </w:pPr>
-            <w:r>
-              <w:rPr>
-                <w:rFonts w:ascii="Sylfaen" w:hAnsi="Sylfaen" w:cs="Sylfaen" w:eastAsia="Sylfaen"/>
-                <w:b w:val="0"/>
-                <w:i w:val="0"/>
-                <w:color w:val="1C2430"/>
-                <w:sz w:val="22"/>
-              </w:rPr>
-              <w:t>9 000·7 000 დამოუკიდებლად, ახსნით.</w:t>
-            </w:r>
-          </w:p>
-          <w:p>
-            <w:pPr>
-              <w:spacing w:before="20" w:after="20" w:line="252" w:lineRule="auto"/>
-            </w:pPr>
-            <w:r>
-              <w:rPr>
-                <w:rFonts w:ascii="Sylfaen" w:hAnsi="Sylfaen" w:cs="Sylfaen" w:eastAsia="Sylfaen"/>
-                <w:b w:val="0"/>
-                <w:i w:val="0"/>
-                <w:color w:val="1C2430"/>
-                <w:sz w:val="22"/>
-              </w:rPr>
-              <w:t>გვ. 65, №4: 2 430·97 ≈ 2 000·100 = 200 000.</w:t>
-            </w:r>
-          </w:p>
-          <w:p>
-            <w:pPr>
-              <w:spacing w:before="20" w:after="20" w:line="252" w:lineRule="auto"/>
-            </w:pPr>
-            <w:r>
-              <w:rPr>
-                <w:rFonts w:ascii="Sylfaen" w:hAnsi="Sylfaen" w:cs="Sylfaen" w:eastAsia="Sylfaen"/>
-                <w:b w:val="0"/>
-                <w:i w:val="0"/>
-                <w:color w:val="1C2430"/>
-                <w:sz w:val="22"/>
-              </w:rPr>
-              <w:t>თვითონ შეადგინონ ერთი მაგალითი, სადაც ნამრავლი „დაახლოებით“ მილიონს გადაცილდება.</w:t>
-            </w:r>
-          </w:p>
-        </w:tc>
-      </w:tr>
-    </w:tbl>
-    <w:p>
-      <w:pPr>
-        <w:spacing w:before="240" w:after="80" w:line="259" w:lineRule="auto"/>
-      </w:pPr>
-      <w:r>
-        <w:rPr>
-          <w:rFonts w:ascii="Sylfaen" w:hAnsi="Sylfaen" w:cs="Sylfaen" w:eastAsia="Sylfaen"/>
-          <w:b/>
-          <w:i w:val="0"/>
-          <w:color w:val="8E2F3C"/>
-          <w:sz w:val="28"/>
-        </w:rPr>
-        <w:t>შეფასება</w:t>
-      </w:r>
-    </w:p>
-    <w:p>
-      <w:pPr>
-        <w:spacing w:before="0" w:after="80" w:line="259" w:lineRule="auto"/>
+        <w:spacing w:before="0" w:after="120" w:line="269" w:lineRule="auto"/>
       </w:pPr>
       <w:r>
         <w:rPr>
@@ -2102,7 +474,37 @@
           <w:color w:val="1C2430"/>
           <w:sz w:val="24"/>
         </w:rPr>
-        <w:t>ქულა არ იწერება. „სწორ კარზე“ უყურებთ ახსნას, პასუხის სისწრაფეს კი არა. გაკვეთილი შედგა, თუ უმეტესობა 400·70-ს 28 000-ად ხსნის და 5·(9+4)-ს ორ გზად ხედავს.</w:t>
+        <w:t>ჯერ გვ. 56-ის მაგალითი: ხუთ მოსწავლეს თითო 6 რვეული აქვს. დავთვალოთ შეკრებითაც და გამრავლებითაც. დაფაზე ავწეროთ — მამრავლი, მამრავლი, ნამრავლი.</w:t>
+      </w:r>
+    </w:p>
+    <w:p>
+      <w:pPr>
+        <w:spacing w:before="0" w:after="120" w:line="269" w:lineRule="auto"/>
+      </w:pPr>
+      <w:r>
+        <w:rPr>
+          <w:rFonts w:ascii="Sylfaen" w:hAnsi="Sylfaen" w:cs="Sylfaen" w:eastAsia="Sylfaen"/>
+          <w:b w:val="0"/>
+          <w:i w:val="0"/>
+          <w:color w:val="1C2430"/>
+          <w:sz w:val="24"/>
+        </w:rPr>
+        <w:t>მერე თვისებები. გადანაცვლება, ერთი, ნული, ჯგუფების თვისება, განაწილება. განაწილებაზე ორივე გზა ჩავწეროთ: 5·(9+4) და 5·9+5·4. იქვე 9a+7a. ჯგუფების თვისებაზე დიდხანს არ ვჩერდებით; თუ დრო გვაკლია, ერთი მაგალითიც კმარა.</w:t>
+      </w:r>
+    </w:p>
+    <w:p>
+      <w:pPr>
+        <w:spacing w:before="0" w:after="120" w:line="269" w:lineRule="auto"/>
+      </w:pPr>
+      <w:r>
+        <w:rPr>
+          <w:rFonts w:ascii="Sylfaen" w:hAnsi="Sylfaen" w:cs="Sylfaen" w:eastAsia="Sylfaen"/>
+          <w:b w:val="0"/>
+          <w:i w:val="0"/>
+          <w:color w:val="1C2430"/>
+          <w:sz w:val="24"/>
+        </w:rPr>
+        <w:t>ბოლოს გვ. 57-ის კითხვები სლაიდიდან. ვინც დაამთავრებს, რვეულში გადაიტანს. ზარის წინ საშინაოს ვამბობთ.</w:t>
       </w:r>
     </w:p>
     <w:p>
@@ -2133,7 +535,7 @@
           <w:color w:val="1C2430"/>
           <w:sz w:val="22"/>
         </w:rPr>
-        <w:t>•  გვ. 57, „კლასში“ — №1, №3, №4.</w:t>
+        <w:t>•  გვ. 57, №1–№5 რვეულში. კლასში ნანახიც მოკლედ ჩაიწერონ.</w:t>
       </w:r>
     </w:p>
     <w:p>
@@ -2149,23 +551,7 @@
           <w:color w:val="1C2430"/>
           <w:sz w:val="22"/>
         </w:rPr>
-        <w:t>•  გვ. 65 — 50·300, 50·3 000, 50·30 000.</w:t>
-      </w:r>
-    </w:p>
-    <w:p>
-      <w:pPr>
-        <w:spacing w:before="0" w:after="40" w:line="259" w:lineRule="auto"/>
-        <w:ind w:left="340"/>
-      </w:pPr>
-      <w:r>
-        <w:rPr>
-          <w:rFonts w:ascii="Sylfaen" w:hAnsi="Sylfaen" w:cs="Sylfaen" w:eastAsia="Sylfaen"/>
-          <w:b w:val="0"/>
-          <w:i w:val="0"/>
-          <w:color w:val="1C2430"/>
-          <w:sz w:val="22"/>
-        </w:rPr>
-        <w:t>•  სურვილისამებრ: გვ. 65, №4 — 2 430·97 უმაღლეს თანრიგამდე და მიახლოებითი ნამრავლი.</w:t>
+        <w:t>•  თითო თვისებაზე ერთი საკუთარი მაგალითი: გადანაცვლება, ნული, განაწილება.</w:t>
       </w:r>
     </w:p>
     <w:p>
@@ -2180,7 +566,7 @@
           <w:color w:val="8E2F3C"/>
           <w:sz w:val="28"/>
         </w:rPr>
-        <w:t>პასუხები მასწავლებლისთვის</w:t>
+        <w:t>პასუხები</w:t>
       </w:r>
     </w:p>
     <w:tbl>
@@ -2206,7 +592,7 @@
         </w:trPr>
         <w:tc>
           <w:tcPr>
-            <w:tcW w:type="dxa" w:w="2948"/>
+            <w:tcW w:type="dxa" w:w="1814"/>
             <w:shd w:val="clear" w:fill="FBF6EE"/>
             <w:tcBorders>
               <w:top w:val="single" w:sz="4" w:space="0" w:color="E7DCCB"/>
@@ -2234,15 +620,15 @@
                 <w:b/>
                 <w:i w:val="0"/>
                 <w:color w:val="1C2430"/>
-                <w:sz w:val="21"/>
+                <w:sz w:val="22"/>
               </w:rPr>
-              <w:t>სლაიდი 12, სწორი კარი</w:t>
+              <w:t>№1</w:t>
             </w:r>
           </w:p>
         </w:tc>
         <w:tc>
           <w:tcPr>
-            <w:tcW w:type="dxa" w:w="7030"/>
+            <w:tcW w:type="dxa" w:w="8164"/>
             <w:tcBorders>
               <w:top w:val="single" w:sz="4" w:space="0" w:color="E7DCCB"/>
               <w:left w:val="single" w:sz="4" w:space="0" w:color="E7DCCB"/>
@@ -2269,9 +655,9 @@
                 <w:b w:val="0"/>
                 <w:i w:val="0"/>
                 <w:color w:val="1C2430"/>
-                <w:sz w:val="21"/>
+                <w:sz w:val="22"/>
               </w:rPr>
-              <w:t>5·27  ·  0  ·  7a+7c  ·  28 000</w:t>
+              <w:t>0 · a = 0</w:t>
             </w:r>
           </w:p>
         </w:tc>
@@ -2282,7 +668,7 @@
         </w:trPr>
         <w:tc>
           <w:tcPr>
-            <w:tcW w:type="dxa" w:w="2948"/>
+            <w:tcW w:type="dxa" w:w="1814"/>
             <w:shd w:val="clear" w:fill="FBF6EE"/>
             <w:tcBorders>
               <w:top w:val="single" w:sz="4" w:space="0" w:color="E7DCCB"/>
@@ -2310,15 +696,15 @@
                 <w:b/>
                 <w:i w:val="0"/>
                 <w:color w:val="1C2430"/>
-                <w:sz w:val="21"/>
+                <w:sz w:val="22"/>
               </w:rPr>
-              <w:t>სლაიდი 11</w:t>
+              <w:t>№2</w:t>
             </w:r>
           </w:p>
         </w:tc>
         <w:tc>
           <w:tcPr>
-            <w:tcW w:type="dxa" w:w="7030"/>
+            <w:tcW w:type="dxa" w:w="8164"/>
             <w:tcBorders>
               <w:top w:val="single" w:sz="4" w:space="0" w:color="E7DCCB"/>
               <w:left w:val="single" w:sz="4" w:space="0" w:color="E7DCCB"/>
@@ -2345,9 +731,9 @@
                 <w:b w:val="0"/>
                 <w:i w:val="0"/>
                 <w:color w:val="1C2430"/>
-                <w:sz w:val="21"/>
+                <w:sz w:val="22"/>
               </w:rPr>
-              <w:t>15 000  ·  1 600 000  ·  63 000 000</w:t>
+              <w:t>27 + 27 + 27 + 27 + 27 = 5 · 27</w:t>
             </w:r>
           </w:p>
         </w:tc>
@@ -2358,7 +744,7 @@
         </w:trPr>
         <w:tc>
           <w:tcPr>
-            <w:tcW w:type="dxa" w:w="2948"/>
+            <w:tcW w:type="dxa" w:w="1814"/>
             <w:shd w:val="clear" w:fill="FBF6EE"/>
             <w:tcBorders>
               <w:top w:val="single" w:sz="4" w:space="0" w:color="E7DCCB"/>
@@ -2386,15 +772,15 @@
                 <w:b/>
                 <w:i w:val="0"/>
                 <w:color w:val="1C2430"/>
-                <w:sz w:val="21"/>
+                <w:sz w:val="22"/>
               </w:rPr>
-              <w:t>სლაიდი 13</w:t>
+              <w:t>№3</w:t>
             </w:r>
           </w:p>
         </w:tc>
         <w:tc>
           <w:tcPr>
-            <w:tcW w:type="dxa" w:w="7030"/>
+            <w:tcW w:type="dxa" w:w="8164"/>
             <w:tcBorders>
               <w:top w:val="single" w:sz="4" w:space="0" w:color="E7DCCB"/>
               <w:left w:val="single" w:sz="4" w:space="0" w:color="E7DCCB"/>
@@ -2421,9 +807,9 @@
                 <w:b w:val="0"/>
                 <w:i w:val="0"/>
                 <w:color w:val="1C2430"/>
-                <w:sz w:val="21"/>
+                <w:sz w:val="22"/>
               </w:rPr>
-              <w:t>18·26 700 &lt; 626 000, რადგან 20·30 000 = 600 000 და ორივე მამრავლი გაზრდილია. თუ დროა: 238·41 &gt; 8 000</w:t>
+              <w:t>თუ a = 7, მაშინ 8a = 56</w:t>
             </w:r>
           </w:p>
         </w:tc>
@@ -2434,7 +820,7 @@
         </w:trPr>
         <w:tc>
           <w:tcPr>
-            <w:tcW w:type="dxa" w:w="2948"/>
+            <w:tcW w:type="dxa" w:w="1814"/>
             <w:shd w:val="clear" w:fill="FBF6EE"/>
             <w:tcBorders>
               <w:top w:val="single" w:sz="4" w:space="0" w:color="E7DCCB"/>
@@ -2462,15 +848,15 @@
                 <w:b/>
                 <w:i w:val="0"/>
                 <w:color w:val="1C2430"/>
-                <w:sz w:val="21"/>
+                <w:sz w:val="22"/>
               </w:rPr>
-              <w:t>საშინაო 1</w:t>
+              <w:t>№4</w:t>
             </w:r>
           </w:p>
         </w:tc>
         <w:tc>
           <w:tcPr>
-            <w:tcW w:type="dxa" w:w="7030"/>
+            <w:tcW w:type="dxa" w:w="8164"/>
             <w:tcBorders>
               <w:top w:val="single" w:sz="4" w:space="0" w:color="E7DCCB"/>
               <w:left w:val="single" w:sz="4" w:space="0" w:color="E7DCCB"/>
@@ -2497,9 +883,9 @@
                 <w:b w:val="0"/>
                 <w:i w:val="0"/>
                 <w:color w:val="1C2430"/>
-                <w:sz w:val="21"/>
+                <w:sz w:val="22"/>
               </w:rPr>
-              <w:t>0·a = 0  ·  8·7 = 56  ·  11·0 = 0</w:t>
+              <w:t>თუ a = 0, მაშინ 11a = 0</w:t>
             </w:r>
           </w:p>
         </w:tc>
@@ -2510,7 +896,7 @@
         </w:trPr>
         <w:tc>
           <w:tcPr>
-            <w:tcW w:type="dxa" w:w="2948"/>
+            <w:tcW w:type="dxa" w:w="1814"/>
             <w:shd w:val="clear" w:fill="FBF6EE"/>
             <w:tcBorders>
               <w:top w:val="single" w:sz="4" w:space="0" w:color="E7DCCB"/>
@@ -2538,15 +924,15 @@
                 <w:b/>
                 <w:i w:val="0"/>
                 <w:color w:val="1C2430"/>
-                <w:sz w:val="21"/>
+                <w:sz w:val="22"/>
               </w:rPr>
-              <w:t>საშინაო 2</w:t>
+              <w:t>№5</w:t>
             </w:r>
           </w:p>
         </w:tc>
         <w:tc>
           <w:tcPr>
-            <w:tcW w:type="dxa" w:w="7030"/>
+            <w:tcW w:type="dxa" w:w="8164"/>
             <w:tcBorders>
               <w:top w:val="single" w:sz="4" w:space="0" w:color="E7DCCB"/>
               <w:left w:val="single" w:sz="4" w:space="0" w:color="E7DCCB"/>
@@ -2573,85 +959,9 @@
                 <w:b w:val="0"/>
                 <w:i w:val="0"/>
                 <w:color w:val="1C2430"/>
-                <w:sz w:val="21"/>
+                <w:sz w:val="22"/>
               </w:rPr>
-              <w:t>15 000  ·  150 000  ·  1 500 000</w:t>
-            </w:r>
-          </w:p>
-        </w:tc>
-      </w:tr>
-      <w:tr>
-        <w:trPr>
-          <w:cantSplit/>
-        </w:trPr>
-        <w:tc>
-          <w:tcPr>
-            <w:tcW w:type="dxa" w:w="2948"/>
-            <w:shd w:val="clear" w:fill="FBF6EE"/>
-            <w:tcBorders>
-              <w:top w:val="single" w:sz="4" w:space="0" w:color="E7DCCB"/>
-              <w:left w:val="single" w:sz="4" w:space="0" w:color="E7DCCB"/>
-              <w:bottom w:val="single" w:sz="4" w:space="0" w:color="E7DCCB"/>
-              <w:right w:val="single" w:sz="4" w:space="0" w:color="E7DCCB"/>
-            </w:tcBorders>
-            <w:tcMar>
-              <w:top w:w="60" w:type="dxa"/>
-              <w:left w:w="80" w:type="dxa"/>
-              <w:bottom w:w="60" w:type="dxa"/>
-              <w:right w:w="80" w:type="dxa"/>
-            </w:tcMar>
-            <w:vAlign w:val="center"/>
-          </w:tcPr>
-          <w:p>
-            <w:pPr>
-              <w:spacing w:before="0" w:after="0" w:line="252" w:lineRule="auto"/>
-              <w:jc w:val="left"/>
-            </w:pPr>
-            <w:r/>
-            <w:r>
-              <w:rPr>
-                <w:rFonts w:ascii="Sylfaen" w:hAnsi="Sylfaen" w:cs="Sylfaen" w:eastAsia="Sylfaen"/>
-                <w:b/>
-                <w:i w:val="0"/>
-                <w:color w:val="1C2430"/>
-                <w:sz w:val="21"/>
-              </w:rPr>
-              <w:t>სურვილისამებრ</w:t>
-            </w:r>
-          </w:p>
-        </w:tc>
-        <w:tc>
-          <w:tcPr>
-            <w:tcW w:type="dxa" w:w="7030"/>
-            <w:tcBorders>
-              <w:top w:val="single" w:sz="4" w:space="0" w:color="E7DCCB"/>
-              <w:left w:val="single" w:sz="4" w:space="0" w:color="E7DCCB"/>
-              <w:bottom w:val="single" w:sz="4" w:space="0" w:color="E7DCCB"/>
-              <w:right w:val="single" w:sz="4" w:space="0" w:color="E7DCCB"/>
-            </w:tcBorders>
-            <w:tcMar>
-              <w:top w:w="60" w:type="dxa"/>
-              <w:left w:w="80" w:type="dxa"/>
-              <w:bottom w:w="60" w:type="dxa"/>
-              <w:right w:w="80" w:type="dxa"/>
-            </w:tcMar>
-            <w:vAlign w:val="center"/>
-          </w:tcPr>
-          <w:p>
-            <w:pPr>
-              <w:spacing w:before="0" w:after="0" w:line="252" w:lineRule="auto"/>
-              <w:jc w:val="left"/>
-            </w:pPr>
-            <w:r/>
-            <w:r>
-              <w:rPr>
-                <w:rFonts w:ascii="Sylfaen" w:hAnsi="Sylfaen" w:cs="Sylfaen" w:eastAsia="Sylfaen"/>
-                <w:b w:val="0"/>
-                <w:i w:val="0"/>
-                <w:color w:val="1C2430"/>
-                <w:sz w:val="21"/>
-              </w:rPr>
-              <w:t>2 000·100 = 200 000</w:t>
+              <w:t>7(a + c) = 7a + 7c</w:t>
             </w:r>
           </w:p>
         </w:tc>
@@ -2669,7 +979,7 @@
           <w:color w:val="8E2F3C"/>
           <w:sz w:val="28"/>
         </w:rPr>
-        <w:t>სლაიდები და მართვა</w:t>
+        <w:t>სლაიდები</w:t>
       </w:r>
     </w:p>
     <w:p>
@@ -2682,9 +992,9 @@
           <w:b w:val="0"/>
           <w:i w:val="0"/>
           <w:color w:val="1C2430"/>
-          <w:sz w:val="22"/>
+          <w:sz w:val="24"/>
         </w:rPr>
-        <w:t>1 სათაური · 2 ფანქრები · 3 სიტყვები · 4 გადანაცვლება · 5 ერთი და ნული · 6 ჯგუფები · 7 განაწილება · 8 მსგავსი წევრები · 9 ნულების კიბე · 10 ორივე მხარეს · 11 სცადე შენ · 12 სწორი კარი · 13 შეფასება · 14 სამი სიტყვა · 15 საშინაო.</w:t>
+        <w:t>1 სათაური, 2 რვეულები, 3 სიტყვები, 4 გადანაცვლება, 5 ერთი და ნული, 6 ჯგუფები, 7 განაწილება, 8 შესაკრებები, 9 კითხვები, 10 შეჯამება, 11 საშინაო.</w:t>
       </w:r>
     </w:p>
     <w:p>
@@ -2697,9 +1007,9 @@
           <w:b w:val="0"/>
           <w:i w:val="0"/>
           <w:color w:val="1C2430"/>
-          <w:sz w:val="22"/>
+          <w:sz w:val="24"/>
         </w:rPr>
-        <w:t>ისრები ან ეკრანის გვერდითა ღილაკები — გადასვლა. პასუხი იხსნება ღილაკით და კლასს წინასწარ არ უჩანს. T — მოკლე შენიშვნა მხოლოდ თქვენთვის. F — მთელი ეკრანი. ფაილი prezentacia.html და საქაღალდე fonts ერთად უნდა იყოს.</w:t>
+        <w:t>ისრით ან გვერდითა ღილაკით გადადის. პასუხი ღილაკზე იხსნება. T — შენიშვნა, F — მთელი ეკრანი.</w:t>
       </w:r>
     </w:p>
     <w:sectPr>
@@ -2729,7 +1039,7 @@
         <w:color w:val="5E6872"/>
         <w:sz w:val="18"/>
       </w:rPr>
-      <w:t>მათემატიკა  ·  V კლასი  ·  40 წუთი  ·  პრეზენტაცია: prezentacia.html</w:t>
+      <w:t>მათემატიკა, V კლასი. გამრავლების თვისებები</w:t>
     </w:r>
   </w:p>
 </w:ftr>

</xml_diff>

<commit_message>
Add the number-ray lesson and letter notation to properties.
The properties class now separates an expression, an equality, and an inequality. The new 40-minute plan and slides cover the number ray on page 49.

Co-authored-by: Beka Tevdorashvili <bekatev@users.noreply.github.com>
</commit_message>
<xml_diff>
--- a/lesson/sagakvetilo-gegma.docx
+++ b/lesson/sagakvetilo-gegma.docx
@@ -504,6 +504,21 @@
           <w:color w:val="1C2430"/>
           <w:sz w:val="24"/>
         </w:rPr>
+        <w:t>იქვე ასოებით ჩაწერა. 8a იგივეა, რაც 8·a. გამოსახულებას ტოლობის ნიშანი არ აქვს, მაგალითად 8a ან 9a+7a. ტოლობაში ორი გამოსახულება ტოლია: 9a+7a=16a. უტოლობაში შედარებაა: 8a&gt;50.</w:t>
+      </w:r>
+    </w:p>
+    <w:p>
+      <w:pPr>
+        <w:spacing w:before="0" w:after="120" w:line="269" w:lineRule="auto"/>
+      </w:pPr>
+      <w:r>
+        <w:rPr>
+          <w:rFonts w:ascii="Sylfaen" w:hAnsi="Sylfaen" w:cs="Sylfaen" w:eastAsia="Sylfaen"/>
+          <w:b w:val="0"/>
+          <w:i w:val="0"/>
+          <w:color w:val="1C2430"/>
+          <w:sz w:val="24"/>
+        </w:rPr>
         <w:t>ბოლოს გვ. 57-ის კითხვები სლაიდიდან. ვინც დაამთავრებს, რვეულში გადაიტანს. ზარის წინ საშინაოს ვამბობთ.</w:t>
       </w:r>
     </w:p>
@@ -551,7 +566,7 @@
           <w:color w:val="1C2430"/>
           <w:sz w:val="22"/>
         </w:rPr>
-        <w:t>•  თითო თვისებაზე ერთი საკუთარი მაგალითი: გადანაცვლება, ნული, განაწილება.</w:t>
+        <w:t>•  ასო a-თი: ერთი გამოსახულება, ერთი ტოლობა და ერთი უტოლობა. მაგალითად 8a, 8a=56, 8a&gt;50.</w:t>
       </w:r>
     </w:p>
     <w:p>
@@ -994,7 +1009,7 @@
           <w:color w:val="1C2430"/>
           <w:sz w:val="24"/>
         </w:rPr>
-        <w:t>1 სათაური, 2 რვეულები, 3 სიტყვები, 4 გადანაცვლება, 5 ერთი და ნული, 6 ჯგუფები, 7 განაწილება, 8 შესაკრებები, 9 კითხვები, 10 შეჯამება, 11 საშინაო.</w:t>
+        <w:t>1 სათაური, 2 რვეულები, 3 სიტყვები, 4 გადანაცვლება, 5 ერთი და ნული, 6 ჯგუფები, 7 განაწილება, 8 შესაკრებები, 9 ასოებით, 10 გამოსახულება და ტოლობა, 11 კითხვები, 12 შეჯამება, 13 საშინაო.</w:t>
       </w:r>
     </w:p>
     <w:p>

</xml_diff>

<commit_message>
Write the properties lesson plan as classroom steps, not a form.
Drop the file name, the blank teacher line, and the bell note, and spell out the examples for pages 56–57.

Co-authored-by: Beka Tevdorashvili <bekatev@users.noreply.github.com>
</commit_message>
<xml_diff>
--- a/lesson/sagakvetilo-gegma.docx
+++ b/lesson/sagakvetilo-gegma.docx
@@ -298,7 +298,7 @@
                 <w:color w:val="8E2F3C"/>
                 <w:sz w:val="22"/>
               </w:rPr>
-              <w:t>პრეზენტაცია</w:t>
+              <w:t>დრო</w:t>
             </w:r>
           </w:p>
         </w:tc>
@@ -334,84 +334,7 @@
                 <w:color w:val="1C2430"/>
                 <w:sz w:val="22"/>
               </w:rPr>
-              <w:t>prezentacia.html — იხსნება ბრაუზერში. fonts-ის საქაღალდე თან უნდა იყოს</w:t>
-            </w:r>
-          </w:p>
-        </w:tc>
-      </w:tr>
-      <w:tr>
-        <w:trPr>
-          <w:cantSplit/>
-        </w:trPr>
-        <w:tc>
-          <w:tcPr>
-            <w:tcW w:type="dxa" w:w="2381"/>
-            <w:shd w:val="clear" w:fill="FBF6EE"/>
-            <w:tcBorders>
-              <w:top w:val="single" w:sz="4" w:space="0" w:color="E7DCCB"/>
-              <w:left w:val="single" w:sz="4" w:space="0" w:color="E7DCCB"/>
-              <w:bottom w:val="single" w:sz="4" w:space="0" w:color="E7DCCB"/>
-              <w:right w:val="single" w:sz="4" w:space="0" w:color="E7DCCB"/>
-            </w:tcBorders>
-            <w:tcMar>
-              <w:top w:w="60" w:type="dxa"/>
-              <w:left w:w="80" w:type="dxa"/>
-              <w:bottom w:w="60" w:type="dxa"/>
-              <w:right w:w="80" w:type="dxa"/>
-            </w:tcMar>
-            <w:vAlign w:val="center"/>
-          </w:tcPr>
-          <w:p>
-            <w:pPr>
-              <w:spacing w:before="0" w:after="0" w:line="252" w:lineRule="auto"/>
-              <w:jc w:val="left"/>
-            </w:pPr>
-            <w:r/>
-            <w:r>
-              <w:rPr>
-                <w:rFonts w:ascii="Sylfaen" w:hAnsi="Sylfaen" w:cs="Sylfaen" w:eastAsia="Sylfaen"/>
-                <w:b/>
-                <w:i w:val="0"/>
-                <w:color w:val="8E2F3C"/>
-                <w:sz w:val="22"/>
-              </w:rPr>
-              <w:t>შევსება</w:t>
-            </w:r>
-          </w:p>
-        </w:tc>
-        <w:tc>
-          <w:tcPr>
-            <w:tcW w:type="dxa" w:w="7597"/>
-            <w:shd w:val="clear" w:fill="FFFFFF"/>
-            <w:tcBorders>
-              <w:top w:val="single" w:sz="4" w:space="0" w:color="E7DCCB"/>
-              <w:left w:val="single" w:sz="4" w:space="0" w:color="E7DCCB"/>
-              <w:bottom w:val="single" w:sz="4" w:space="0" w:color="E7DCCB"/>
-              <w:right w:val="single" w:sz="4" w:space="0" w:color="E7DCCB"/>
-            </w:tcBorders>
-            <w:tcMar>
-              <w:top w:w="60" w:type="dxa"/>
-              <w:left w:w="80" w:type="dxa"/>
-              <w:bottom w:w="60" w:type="dxa"/>
-              <w:right w:w="80" w:type="dxa"/>
-            </w:tcMar>
-            <w:vAlign w:val="center"/>
-          </w:tcPr>
-          <w:p>
-            <w:pPr>
-              <w:spacing w:before="0" w:after="0" w:line="252" w:lineRule="auto"/>
-              <w:jc w:val="left"/>
-            </w:pPr>
-            <w:r/>
-            <w:r>
-              <w:rPr>
-                <w:rFonts w:ascii="Sylfaen" w:hAnsi="Sylfaen" w:cs="Sylfaen" w:eastAsia="Sylfaen"/>
-                <w:b w:val="0"/>
-                <w:i w:val="0"/>
-                <w:color w:val="1C2430"/>
-                <w:sz w:val="22"/>
-              </w:rPr>
-              <w:t>მასწავლებელი ____________________    თარიღი __________</w:t>
+              <w:t>40 წუთი</w:t>
             </w:r>
           </w:p>
         </w:tc>
@@ -444,7 +367,7 @@
           <w:color w:val="1C2430"/>
           <w:sz w:val="24"/>
         </w:rPr>
-        <w:t>მოსწავლემ გაიხსენოს გამრავლების თვისებები და მაგალითში ამოიცნოს, რომელი მათგანია გამოყენებული.</w:t>
+        <w:t>გამრავლების თვისების ამოცნობა, მოკლე ჩანაწერი ასოთი და გამოსახულების, ტოლობისა და უტოლობის გარჩევა.</w:t>
       </w:r>
     </w:p>
     <w:p>
@@ -459,7 +382,7 @@
           <w:color w:val="8E2F3C"/>
           <w:sz w:val="28"/>
         </w:rPr>
-        <w:t>მსვლელობა</w:t>
+        <w:t>შესავალი</w:t>
       </w:r>
     </w:p>
     <w:p>
@@ -474,7 +397,7 @@
           <w:color w:val="1C2430"/>
           <w:sz w:val="24"/>
         </w:rPr>
-        <w:t>ჯერ გვ. 56-ის მაგალითი: ხუთ მოსწავლეს თითო 6 რვეული აქვს. დავთვალოთ შეკრებითაც და გამრავლებითაც. დაფაზე ავწეროთ — მამრავლი, მამრავლი, ნამრავლი.</w:t>
+        <w:t>გვ. 56. ხუთ მოსწავლეს თითო 6 რვეული აქვს. ჯერ ვკრებთ: 6+6+6+6+6. მერე იგივეს ვწერთ გამრავლებით: 5·6. ორივე გზით 30 გამოდის. აქედან ჩანს, რომ გამრავლება განმეორებითი შეკრებაა.</w:t>
       </w:r>
     </w:p>
     <w:p>
@@ -489,7 +412,22 @@
           <w:color w:val="1C2430"/>
           <w:sz w:val="24"/>
         </w:rPr>
-        <w:t>მერე თვისებები. გადანაცვლება, ერთი, ნული, ჯგუფების თვისება, განაწილება. განაწილებაზე ორივე გზა ჩავწეროთ: 5·(9+4) და 5·9+5·4. იქვე 9a+7a. ჯგუფების თვისებაზე დიდხანს არ ვჩერდებით; თუ დრო გვაკლია, ერთი მაგალითიც კმარა.</w:t>
+        <w:t>5·6=30 დაფაზე რჩება. 5 და 6 მამრავლებია, 30 ნამრავლი. ეს სამი სიტყვა ერთხელ ხმამაღლა წაიკითხოს ერთმა მოსწავლემ.</w:t>
+      </w:r>
+    </w:p>
+    <w:p>
+      <w:pPr>
+        <w:spacing w:before="240" w:after="80" w:line="259" w:lineRule="auto"/>
+      </w:pPr>
+      <w:r>
+        <w:rPr>
+          <w:rFonts w:ascii="Sylfaen" w:hAnsi="Sylfaen" w:cs="Sylfaen" w:eastAsia="Sylfaen"/>
+          <w:b/>
+          <w:i w:val="0"/>
+          <w:color w:val="8E2F3C"/>
+          <w:sz w:val="28"/>
+        </w:rPr>
+        <w:t>თვისებები</w:t>
       </w:r>
     </w:p>
     <w:p>
@@ -504,7 +442,7 @@
           <w:color w:val="1C2430"/>
           <w:sz w:val="24"/>
         </w:rPr>
-        <w:t>იქვე ასოებით ჩაწერა. 8a იგივეა, რაც 8·a. გამოსახულებას ტოლობის ნიშანი არ აქვს, მაგალითად 8a ან 9a+7a. ტოლობაში ორი გამოსახულება ტოლია: 9a+7a=16a. უტოლობაში შედარებაა: 8a&gt;50.</w:t>
+        <w:t>გადანაცვლება. 6·5 და 5·6 ერთი და იგივე ნამრავლია, 30. მამრავლების ადგილის გაცვლა ნამრავლს არ ცვლის. ორმა მოსწავლემ შეიძლება ადგილიც გაცვალოს, რომ ეს თვალითაც გამოჩნდეს.</w:t>
       </w:r>
     </w:p>
     <w:p>
@@ -519,7 +457,142 @@
           <w:color w:val="1C2430"/>
           <w:sz w:val="24"/>
         </w:rPr>
-        <w:t>ბოლოს გვ. 57-ის კითხვები სლაიდიდან. ვინც დაამთავრებს, რვეულში გადაიტანს. ზარის წინ საშინაოს ვამბობთ.</w:t>
+        <w:t>ერთი და ნული. 7·1=7, რიცხვი არ იცვლება. 8·1-ზეც იგივეა. 7·0=0 და 9·0=0. ნულზე გამრავლება ყოველთვის ნულს იძლევა, ამიტომ 0·a=0, რა რიცხვიც არ უნდა იყოს a.</w:t>
+      </w:r>
+    </w:p>
+    <w:p>
+      <w:pPr>
+        <w:spacing w:before="0" w:after="120" w:line="269" w:lineRule="auto"/>
+      </w:pPr>
+      <w:r>
+        <w:rPr>
+          <w:rFonts w:ascii="Sylfaen" w:hAnsi="Sylfaen" w:cs="Sylfaen" w:eastAsia="Sylfaen"/>
+          <w:b w:val="0"/>
+          <w:i w:val="0"/>
+          <w:color w:val="1C2430"/>
+          <w:sz w:val="24"/>
+        </w:rPr>
+        <w:t>ჯგუფების თვისებას ერთი მაგალითიც ჰყოფნის. (3·4)·5=12·5=60 და 3·(4·5)=3·20=60. ფრჩხილის გადატანა ნამრავლს არ ცვლის.</w:t>
+      </w:r>
+    </w:p>
+    <w:p>
+      <w:pPr>
+        <w:spacing w:before="0" w:after="120" w:line="269" w:lineRule="auto"/>
+      </w:pPr>
+      <w:r>
+        <w:rPr>
+          <w:rFonts w:ascii="Sylfaen" w:hAnsi="Sylfaen" w:cs="Sylfaen" w:eastAsia="Sylfaen"/>
+          <w:b w:val="0"/>
+          <w:i w:val="0"/>
+          <w:color w:val="1C2430"/>
+          <w:sz w:val="24"/>
+        </w:rPr>
+        <w:t>განაწილებაზე ცოტა მეტხანს ვჩერდებით. 5·(9+4) ორი გზით იწერება: ჯერ ფრჩხილში, 5·13=65, და ცალ-ცალკე, 5·9+5·4=45+20=65. მოკლე ჩანაწერია a(b+c)=ab+ac. მარჯვნიდანაც იგივეა: (b+c)a=ba+ca. სამ შესაკრებზეც მუშაობს: 6·(2+3+5)=6·2+6·3+6·5=60.</w:t>
+      </w:r>
+    </w:p>
+    <w:p>
+      <w:pPr>
+        <w:spacing w:before="0" w:after="120" w:line="269" w:lineRule="auto"/>
+      </w:pPr>
+      <w:r>
+        <w:rPr>
+          <w:rFonts w:ascii="Sylfaen" w:hAnsi="Sylfaen" w:cs="Sylfaen" w:eastAsia="Sylfaen"/>
+          <w:b w:val="0"/>
+          <w:i w:val="0"/>
+          <w:color w:val="1C2430"/>
+          <w:sz w:val="24"/>
+        </w:rPr>
+        <w:t>ერთნაირი შესაკრებები იქიდანვე გამოდის. 9a+7a=(9+7)a=16a. კლასმა თვითონ თქვას 4a+5a, ეს 9a-ა. გამოკლებაზეც ასეა: a(b−c)=ab−ac.</w:t>
+      </w:r>
+    </w:p>
+    <w:p>
+      <w:pPr>
+        <w:spacing w:before="240" w:after="80" w:line="259" w:lineRule="auto"/>
+      </w:pPr>
+      <w:r>
+        <w:rPr>
+          <w:rFonts w:ascii="Sylfaen" w:hAnsi="Sylfaen" w:cs="Sylfaen" w:eastAsia="Sylfaen"/>
+          <w:b/>
+          <w:i w:val="0"/>
+          <w:color w:val="8E2F3C"/>
+          <w:sz w:val="28"/>
+        </w:rPr>
+        <w:t>ასოთი ჩაწერა</w:t>
+      </w:r>
+    </w:p>
+    <w:p>
+      <w:pPr>
+        <w:spacing w:before="0" w:after="120" w:line="269" w:lineRule="auto"/>
+      </w:pPr>
+      <w:r>
+        <w:rPr>
+          <w:rFonts w:ascii="Sylfaen" w:hAnsi="Sylfaen" w:cs="Sylfaen" w:eastAsia="Sylfaen"/>
+          <w:b w:val="0"/>
+          <w:i w:val="0"/>
+          <w:color w:val="1C2430"/>
+          <w:sz w:val="24"/>
+        </w:rPr>
+        <w:t>ასო აქ რიცხვის ადგილას დგას. „a გამრავლებული 8-ზე“ მოკლედ 8a-ა, იგივე რაც 8·a. „a-სა და c-ს ჯამი, გამრავლებული 7-ზე“ არის 7(a+c). „9a-სა და 7a-ს ჯამი“ არის 9a+7a. ჯერ სიტყვიერად ითქვას, მერე დაფაზე ჩაიწეროს.</w:t>
+      </w:r>
+    </w:p>
+    <w:p>
+      <w:pPr>
+        <w:spacing w:before="0" w:after="120" w:line="269" w:lineRule="auto"/>
+      </w:pPr>
+      <w:r>
+        <w:rPr>
+          <w:rFonts w:ascii="Sylfaen" w:hAnsi="Sylfaen" w:cs="Sylfaen" w:eastAsia="Sylfaen"/>
+          <w:b w:val="0"/>
+          <w:i w:val="0"/>
+          <w:color w:val="1C2430"/>
+          <w:sz w:val="24"/>
+        </w:rPr>
+        <w:t>სამი ჩანაწერი ერთმანეთს არ ჰგავს. 8a გამოსახულებაა: მოქმედება წერია და ტოლობის ნიშანი არ აქვს. 8a=56 ტოლობაა: ორი მხარე ტოლია. 8a&gt;50 უტოლობაა: აქ შედარებაა, &gt; ან &lt;. იგივე სვეტად დავალაგოთ 9a+7a, 9a+7a=16a და 16a&gt;10a.</w:t>
+      </w:r>
+    </w:p>
+    <w:p>
+      <w:pPr>
+        <w:spacing w:before="240" w:after="80" w:line="259" w:lineRule="auto"/>
+      </w:pPr>
+      <w:r>
+        <w:rPr>
+          <w:rFonts w:ascii="Sylfaen" w:hAnsi="Sylfaen" w:cs="Sylfaen" w:eastAsia="Sylfaen"/>
+          <w:b/>
+          <w:i w:val="0"/>
+          <w:color w:val="8E2F3C"/>
+          <w:sz w:val="28"/>
+        </w:rPr>
+        <w:t>ვარჯიში</w:t>
+      </w:r>
+    </w:p>
+    <w:p>
+      <w:pPr>
+        <w:spacing w:before="0" w:after="120" w:line="269" w:lineRule="auto"/>
+      </w:pPr>
+      <w:r>
+        <w:rPr>
+          <w:rFonts w:ascii="Sylfaen" w:hAnsi="Sylfaen" w:cs="Sylfaen" w:eastAsia="Sylfaen"/>
+          <w:b w:val="0"/>
+          <w:i w:val="0"/>
+          <w:color w:val="1C2430"/>
+          <w:sz w:val="24"/>
+        </w:rPr>
+        <w:t>გვ. 57-ის ხუთი კითხვა. პასუხამდე ითქვას მიზეზი: ნულის თვისებაა, ხუთი ერთნაირი შესაკრებია თუ განაწილება. კითხვები ასეთია. თუ a ნებისმიერი რიცხვია, 0·a რას უდრის. 27+27+27+27+27 როგორ დაიწეროს გამრავლებით. თუ a=7, რას უდრის 8a. თუ a=0, რას უდრის 11a. 7(a+c) როგორ გაიხსნას.</w:t>
+      </w:r>
+    </w:p>
+    <w:p>
+      <w:pPr>
+        <w:spacing w:before="0" w:after="120" w:line="269" w:lineRule="auto"/>
+      </w:pPr>
+      <w:r>
+        <w:rPr>
+          <w:rFonts w:ascii="Sylfaen" w:hAnsi="Sylfaen" w:cs="Sylfaen" w:eastAsia="Sylfaen"/>
+          <w:b w:val="0"/>
+          <w:i w:val="0"/>
+          <w:color w:val="1C2430"/>
+          <w:sz w:val="24"/>
+        </w:rPr>
+        <w:t>ბოლოს სამ წინადადებაში იკრიბება გაკვეთილი: ადგილის გაცვლა ნამრავლს არ ცვლის; ერთი რიცხვს არ ცვლის, ნული ნულს იძლევა; 8a გამოსახულებაა, 8a=56 ტოლობაა, 8a&gt;50 უტოლობაა.</w:t>
       </w:r>
     </w:p>
     <w:p>
@@ -566,7 +639,7 @@
           <w:color w:val="1C2430"/>
           <w:sz w:val="22"/>
         </w:rPr>
-        <w:t>•  ასო a-თი: ერთი გამოსახულება, ერთი ტოლობა და ერთი უტოლობა. მაგალითად 8a, 8a=56, 8a&gt;50.</w:t>
+        <w:t>•  ასო a-თი სამი ჩანაწერი: ერთი გამოსახულება, ერთი ტოლობა და ერთი უტოლობა. მაგალითად 8a, 8a=56, 8a&gt;50.</w:t>
       </w:r>
     </w:p>
     <w:p>
@@ -982,51 +1055,6 @@
         </w:tc>
       </w:tr>
     </w:tbl>
-    <w:p>
-      <w:pPr>
-        <w:spacing w:before="240" w:after="80" w:line="259" w:lineRule="auto"/>
-      </w:pPr>
-      <w:r>
-        <w:rPr>
-          <w:rFonts w:ascii="Sylfaen" w:hAnsi="Sylfaen" w:cs="Sylfaen" w:eastAsia="Sylfaen"/>
-          <w:b/>
-          <w:i w:val="0"/>
-          <w:color w:val="8E2F3C"/>
-          <w:sz w:val="28"/>
-        </w:rPr>
-        <w:t>სლაიდები</w:t>
-      </w:r>
-    </w:p>
-    <w:p>
-      <w:pPr>
-        <w:spacing w:before="0" w:after="80" w:line="259" w:lineRule="auto"/>
-      </w:pPr>
-      <w:r>
-        <w:rPr>
-          <w:rFonts w:ascii="Sylfaen" w:hAnsi="Sylfaen" w:cs="Sylfaen" w:eastAsia="Sylfaen"/>
-          <w:b w:val="0"/>
-          <w:i w:val="0"/>
-          <w:color w:val="1C2430"/>
-          <w:sz w:val="24"/>
-        </w:rPr>
-        <w:t>1 სათაური, 2 რვეულები, 3 სიტყვები, 4 გადანაცვლება, 5 ერთი და ნული, 6 ჯგუფები, 7 განაწილება, 8 შესაკრებები, 9 ასოებით, 10 გამოსახულება და ტოლობა, 11 კითხვები, 12 შეჯამება, 13 საშინაო.</w:t>
-      </w:r>
-    </w:p>
-    <w:p>
-      <w:pPr>
-        <w:spacing w:before="0" w:after="40" w:line="259" w:lineRule="auto"/>
-      </w:pPr>
-      <w:r>
-        <w:rPr>
-          <w:rFonts w:ascii="Sylfaen" w:hAnsi="Sylfaen" w:cs="Sylfaen" w:eastAsia="Sylfaen"/>
-          <w:b w:val="0"/>
-          <w:i w:val="0"/>
-          <w:color w:val="1C2430"/>
-          <w:sz w:val="24"/>
-        </w:rPr>
-        <w:t>ისრით ან გვერდითა ღილაკით გადადის. პასუხი ღილაკზე იხსნება. T — შენიშვნა, F — მთელი ეკრანი.</w:t>
-      </w:r>
-    </w:p>
     <w:sectPr>
       <w:footerReference w:type="default" r:id="rId9"/>
       <w:pgSz w:w="11906" w:h="16838"/>

</xml_diff>

<commit_message>
Rewrite the multiplication lesson around student discovery and fill the planning scheme.
Use the three property names from the comments, keep one and zero as special cases, and match the slides to the same sequence.

Co-authored-by: Beka Tevdorashvili <bekatev@users.noreply.github.com>
</commit_message>
<xml_diff>
--- a/lesson/sagakvetilo-gegma.docx
+++ b/lesson/sagakvetilo-gegma.docx
@@ -357,7 +357,7 @@
     </w:p>
     <w:p>
       <w:pPr>
-        <w:spacing w:before="0" w:after="80" w:line="259" w:lineRule="auto"/>
+        <w:spacing w:before="0" w:after="120" w:line="269" w:lineRule="auto"/>
       </w:pPr>
       <w:r>
         <w:rPr>
@@ -367,7 +367,7 @@
           <w:color w:val="1C2430"/>
           <w:sz w:val="24"/>
         </w:rPr>
-        <w:t>გამრავლების თვისების ამოცნობა, მოკლე ჩანაწერი ასოთი და გამოსახულების, ტოლობისა და უტოლობის გარჩევა.</w:t>
+        <w:t>მოსწავლემ ამოიცნოს გამრავლების სამი თვისება — გადანაცვლებადობა, ჯუფთებადობა და განრიგებადობა — ჩაწეროს ისინი ასოთი და გაარჩიოს გამოსახულება, ტოლობა და უტოლობა. ერთზე და ნულზე გამრავლება ცალკე დგას, სამ თვისებაში არ შედის.</w:t>
       </w:r>
     </w:p>
     <w:p>
@@ -382,7 +382,7 @@
           <w:color w:val="8E2F3C"/>
           <w:sz w:val="28"/>
         </w:rPr>
-        <w:t>შესავალი</w:t>
+        <w:t>როგორ მიდის</w:t>
       </w:r>
     </w:p>
     <w:p>
@@ -397,7 +397,22 @@
           <w:color w:val="1C2430"/>
           <w:sz w:val="24"/>
         </w:rPr>
-        <w:t>გვ. 56. ხუთ მოსწავლეს თითო 6 რვეული აქვს. ჯერ ვკრებთ: 6+6+6+6+6. მერე იგივეს ვწერთ გამრავლებით: 5·6. ორივე გზით 30 გამოდის. აქედან ჩანს, რომ გამრავლება განმეორებითი შეკრებაა.</w:t>
+        <w:t>თვისებას ჯერ წყვილი ხედავს ორი ანგარიშის შედარებით და თავისი სიტყვით ამბობს, რა არ შეიცვალა. სახელი დაფაზე მერე ჩნდება. სლაიდზე პასუხი და თვისების სახელი დახურულია, სანამ წყვილი არ იტყვის. ქულა არ იწერება. უკუკავშირი საქმეზეა: რა გამოუვიდა და სად აერია.</w:t>
+      </w:r>
+    </w:p>
+    <w:p>
+      <w:pPr>
+        <w:spacing w:before="240" w:after="80" w:line="259" w:lineRule="auto"/>
+      </w:pPr>
+      <w:r>
+        <w:rPr>
+          <w:rFonts w:ascii="Sylfaen" w:hAnsi="Sylfaen" w:cs="Sylfaen" w:eastAsia="Sylfaen"/>
+          <w:b/>
+          <w:i w:val="0"/>
+          <w:color w:val="8E2F3C"/>
+          <w:sz w:val="28"/>
+        </w:rPr>
+        <w:t>წინარე ცოდნა</w:t>
       </w:r>
     </w:p>
     <w:p>
@@ -412,7 +427,7 @@
           <w:color w:val="1C2430"/>
           <w:sz w:val="24"/>
         </w:rPr>
-        <w:t>5·6=30 დაფაზე რჩება. 5 და 6 მამრავლებია, 30 ნამრავლი. ეს სამი სიტყვა ერთხელ ხმამაღლა წაიკითხოს ერთმა მოსწავლემ.</w:t>
+        <w:t>დაფაზე ორი ჩანაწერია: 4+4+4 და 3·4. ჰეტეროგენული წყვილი ეუბნება ერთმანეთს, რომელი უფრო მოკლეა და რატომ. ვინც ჩერდება, სამჯერ ოთხ თითს ითვლის. აქ ჩანს, ვინ ხედავს გამრავლებას განმეორებით შეკრებად.</w:t>
       </w:r>
     </w:p>
     <w:p>
@@ -427,7 +442,7 @@
           <w:color w:val="8E2F3C"/>
           <w:sz w:val="28"/>
         </w:rPr>
-        <w:t>თვისებები</w:t>
+        <w:t>ამოცანა</w:t>
       </w:r>
     </w:p>
     <w:p>
@@ -442,7 +457,22 @@
           <w:color w:val="1C2430"/>
           <w:sz w:val="24"/>
         </w:rPr>
-        <w:t>გადანაცვლება. 6·5 და 5·6 ერთი და იგივე ნამრავლია, 30. მამრავლების ადგილის გაცვლა ნამრავლს არ ცვლის. ორმა მოსწავლემ შეიძლება ადგილიც გაცვალოს, რომ ეს თვალითაც გამოჩნდეს.</w:t>
+        <w:t>კითხვა დაფაზე: „ხუთი მოსწავლიდან თითოეულს 6 რვეული აქვს. სულ რამდენი რვეულია?“ წყვილები ორ გზას ეძებენ. ერთი კრებს 6+6+6+6+6, მეორე წერს 5·6. ორივე 30-ია. ერთი მოსწავლე ხმამაღლა კითხულობს 5·6=30-ს და ასახელებს მამრავლსა და ნამრავლს. ეს ტოლობა დაფაზე რჩება.</w:t>
+      </w:r>
+    </w:p>
+    <w:p>
+      <w:pPr>
+        <w:spacing w:before="240" w:after="80" w:line="259" w:lineRule="auto"/>
+      </w:pPr>
+      <w:r>
+        <w:rPr>
+          <w:rFonts w:ascii="Sylfaen" w:hAnsi="Sylfaen" w:cs="Sylfaen" w:eastAsia="Sylfaen"/>
+          <w:b/>
+          <w:i w:val="0"/>
+          <w:color w:val="8E2F3C"/>
+          <w:sz w:val="28"/>
+        </w:rPr>
+        <w:t>გადანაცვლებადობის თვისება</w:t>
       </w:r>
     </w:p>
     <w:p>
@@ -457,7 +487,22 @@
           <w:color w:val="1C2430"/>
           <w:sz w:val="24"/>
         </w:rPr>
-        <w:t>ერთი და ნული. 7·1=7, რიცხვი არ იცვლება. 8·1-ზეც იგივეა. 7·0=0 და 9·0=0. ნულზე გამრავლება ყოველთვის ნულს იძლევა, ამიტომ 0·a=0, რა რიცხვიც არ უნდა იყოს a.</w:t>
+        <w:t>მეზობელი წყვილები იყოფიან: ერთი ითვლის 6·5-ს, მეორე 5·6-ს. ნამრავლი იგივეა, 30. წყვილი ამბობს, რა არ შეიცვალა. მერე ერქმევა სახელი — გადანაცვლებადობის თვისება — და იწერება a·b=b·a. სურვილისამებრ ორი მოსწავლე ადგილსაც იცვლის, ნამრავლი ისევ 30 რჩება.</w:t>
+      </w:r>
+    </w:p>
+    <w:p>
+      <w:pPr>
+        <w:spacing w:before="240" w:after="80" w:line="259" w:lineRule="auto"/>
+      </w:pPr>
+      <w:r>
+        <w:rPr>
+          <w:rFonts w:ascii="Sylfaen" w:hAnsi="Sylfaen" w:cs="Sylfaen" w:eastAsia="Sylfaen"/>
+          <w:b/>
+          <w:i w:val="0"/>
+          <w:color w:val="8E2F3C"/>
+          <w:sz w:val="28"/>
+        </w:rPr>
+        <w:t>ერთი და ნული</w:t>
       </w:r>
     </w:p>
     <w:p>
@@ -472,7 +517,22 @@
           <w:color w:val="1C2430"/>
           <w:sz w:val="24"/>
         </w:rPr>
-        <w:t>ჯგუფების თვისებას ერთი მაგალითიც ჰყოფნის. (3·4)·5=12·5=60 და 3·(4·5)=3·20=60. ფრჩხილის გადატანა ნამრავლს არ ცვლის.</w:t>
+        <w:t>ეს კერძო შემთხვევაა, სამი თვისებიდან არც ერთი. ჯერ გამოიცნონ, მერე შეამოწმონ: 7·1=7, 8·1=8; 7·0=0, 9·0=0. კლასი ერთად ამბობს სრულ წინადადებას: ერთზე გამრავლება რიცხვს არ ცვლის. ნულზე გამრავლება ნულს იძლევა, ამიტომ 0·a=0, რაც არ უნდა იყოს a.</w:t>
+      </w:r>
+    </w:p>
+    <w:p>
+      <w:pPr>
+        <w:spacing w:before="240" w:after="80" w:line="259" w:lineRule="auto"/>
+      </w:pPr>
+      <w:r>
+        <w:rPr>
+          <w:rFonts w:ascii="Sylfaen" w:hAnsi="Sylfaen" w:cs="Sylfaen" w:eastAsia="Sylfaen"/>
+          <w:b/>
+          <w:i w:val="0"/>
+          <w:color w:val="8E2F3C"/>
+          <w:sz w:val="28"/>
+        </w:rPr>
+        <w:t>ჯუფთებადობის თვისება</w:t>
       </w:r>
     </w:p>
     <w:p>
@@ -487,7 +547,22 @@
           <w:color w:val="1C2430"/>
           <w:sz w:val="24"/>
         </w:rPr>
-        <w:t>განაწილებაზე ცოტა მეტხანს ვჩერდებით. 5·(9+4) ორი გზით იწერება: ჯერ ფრჩხილში, 5·13=65, და ცალ-ცალკე, 5·9+5·4=45+20=65. მოკლე ჩანაწერია a(b+c)=ab+ac. მარჯვნიდანაც იგივეა: (b+c)a=ba+ca. სამ შესაკრებზეც მუშაობს: 6·(2+3+5)=6·2+6·3+6·5=60.</w:t>
+        <w:t>კლასი ორ ნაწილად იყოფა. ერთი მხარე ითვლის (3·4)·5=12·5=60, მეორე 3·(4·5)=3·20=60. მოსწავლეები ამბობენ, რომ ფრჩხილის ადგილმა ნამრავლი არ შეცვალა. სახელი: ჯუფთებადობის თვისება. ჩანაწერი: (a·b)·c=a·(b·c). ერთი მაგალითი საკმარისია.</w:t>
+      </w:r>
+    </w:p>
+    <w:p>
+      <w:pPr>
+        <w:spacing w:before="240" w:after="80" w:line="259" w:lineRule="auto"/>
+      </w:pPr>
+      <w:r>
+        <w:rPr>
+          <w:rFonts w:ascii="Sylfaen" w:hAnsi="Sylfaen" w:cs="Sylfaen" w:eastAsia="Sylfaen"/>
+          <w:b/>
+          <w:i w:val="0"/>
+          <w:color w:val="8E2F3C"/>
+          <w:sz w:val="28"/>
+        </w:rPr>
+        <w:t>განრიგებადობის თვისება</w:t>
       </w:r>
     </w:p>
     <w:p>
@@ -502,7 +577,7 @@
           <w:color w:val="1C2430"/>
           <w:sz w:val="24"/>
         </w:rPr>
-        <w:t>ერთნაირი შესაკრებები იქიდანვე გამოდის. 9a+7a=(9+7)a=16a. კლასმა თვითონ თქვას 4a+5a, ეს 9a-ა. გამოკლებაზეც ასეა: a(b−c)=ab−ac.</w:t>
+        <w:t>ახალი ამოცანა: ხუთ ყუთში თითოში 9 წითელი და 4 ლურჯი რვეული დევს. სულ რამდენია? წყვილი თავად ირჩევს გზას. ზოგი წერს 5·(9+4)=5·13=65, ზოგი 5·9+5·4=45+20=65. ფურცლებს უცვლიან და ამოწმებენ, ერთი რიცხვი გამოვიდა თუ არა. აქედან ჩნდება სახელი — განრიგებადობის თვისება ჯამის მიმართ — და ჩანაწერი a(b+c)=ab+ac. გადანაცვლებადობით იგივეა მარჯვნიდანაც: (b+c)·a=ba+ca. სამ შესაკრებზე ერთი მაგალითი: 6·(2+3+5)=6·2+6·3+6·5=60. გამოკლებაზე: 5·(9−4)=5·9−5·4, ანუ a(b−c)=ab−ac.</w:t>
       </w:r>
     </w:p>
     <w:p>
@@ -517,7 +592,7 @@
           <w:color w:val="8E2F3C"/>
           <w:sz w:val="28"/>
         </w:rPr>
-        <w:t>ასოთი ჩაწერა</w:t>
+        <w:t>საერთო მამრავლი</w:t>
       </w:r>
     </w:p>
     <w:p>
@@ -532,7 +607,22 @@
           <w:color w:val="1C2430"/>
           <w:sz w:val="24"/>
         </w:rPr>
-        <w:t>ასო აქ რიცხვის ადგილას დგას. „a გამრავლებული 8-ზე“ მოკლედ 8a-ა, იგივე რაც 8·a. „a-სა და c-ს ჯამი, გამრავლებული 7-ზე“ არის 7(a+c). „9a-სა და 7a-ს ჯამი“ არის 9a+7a. ჯერ სიტყვიერად ითქვას, მერე დაფაზე ჩაიწეროს.</w:t>
+        <w:t>9a+7a ახალი კანონი არ არის. დაფაზე გვერდიგვერდ დგას უკვე ნანახი 5·9+5·4=5·(9+4) და კითხვა: „მაშინ 9a+7a რას უდრის?“ წყვილი ხედავს, რომ a ორივე შესაკრებში დგას, და წერს (9+7)a=16a. ეს განრიგებადობაა უკან წაკითხული: საერთო მამრავლი ფრჩხილებს გარეთ გადის. მეორე წყვილი ამოწმებს 4a+5a=9a.</w:t>
+      </w:r>
+    </w:p>
+    <w:p>
+      <w:pPr>
+        <w:spacing w:before="240" w:after="80" w:line="259" w:lineRule="auto"/>
+      </w:pPr>
+      <w:r>
+        <w:rPr>
+          <w:rFonts w:ascii="Sylfaen" w:hAnsi="Sylfaen" w:cs="Sylfaen" w:eastAsia="Sylfaen"/>
+          <w:b/>
+          <w:i w:val="0"/>
+          <w:color w:val="8E2F3C"/>
+          <w:sz w:val="28"/>
+        </w:rPr>
+        <w:t>ასოთი და სამი სახის ჩანაწერი</w:t>
       </w:r>
     </w:p>
     <w:p>
@@ -547,7 +637,22 @@
           <w:color w:val="1C2430"/>
           <w:sz w:val="24"/>
         </w:rPr>
-        <w:t>სამი ჩანაწერი ერთმანეთს არ ჰგავს. 8a გამოსახულებაა: მოქმედება წერია და ტოლობის ნიშანი არ აქვს. 8a=56 ტოლობაა: ორი მხარე ტოლია. 8a&gt;50 უტოლობაა: აქ შედარებაა, &gt; ან &lt;. იგივე სვეტად დავალაგოთ 9a+7a, 9a+7a=16a და 16a&gt;10a.</w:t>
+        <w:t>წყვილი სიტყვიდან ჩანაწერზე გადადის. „a გამრავლებული 8-ზე“ არის 8a და a·8; გადანაცვლებადობით ერთი და იგივეა, 8a კი 8·a-ს ნიშნავს. „a-სა და c-ს ჯამი, გამრავლებული 7-ზე“ ორნაირად იწერება: 7(a+c) და (a+c)·7. „9a-სა და 7a-ს ჯამი“ არის 9a+7a.</w:t>
+      </w:r>
+    </w:p>
+    <w:p>
+      <w:pPr>
+        <w:spacing w:before="0" w:after="120" w:line="269" w:lineRule="auto"/>
+      </w:pPr>
+      <w:r>
+        <w:rPr>
+          <w:rFonts w:ascii="Sylfaen" w:hAnsi="Sylfaen" w:cs="Sylfaen" w:eastAsia="Sylfaen"/>
+          <w:b w:val="0"/>
+          <w:i w:val="0"/>
+          <w:color w:val="1C2430"/>
+          <w:sz w:val="24"/>
+        </w:rPr>
+        <w:t>მერე სამ სვეტად ალაგებენ. 8a გამოსახულებაა: მოქმედება წერია და ტოლობის ნიშანი არ აქვს. 8a=56 ტოლობაა. 8a&gt;50 უტოლობაა, აქ &gt; ან &lt; დგას. იგივე სვეტში მეორე რიგია 9a+7a, 9a+7a=16a და 16a&gt;10a.</w:t>
       </w:r>
     </w:p>
     <w:p>
@@ -562,7 +667,7 @@
           <w:color w:val="8E2F3C"/>
           <w:sz w:val="28"/>
         </w:rPr>
-        <w:t>ვარჯიში</w:t>
+        <w:t>გვ. 57</w:t>
       </w:r>
     </w:p>
     <w:p>
@@ -577,7 +682,7 @@
           <w:color w:val="1C2430"/>
           <w:sz w:val="24"/>
         </w:rPr>
-        <w:t>გვ. 57-ის ხუთი კითხვა. პასუხამდე ითქვას მიზეზი: ნულის თვისებაა, ხუთი ერთნაირი შესაკრებია თუ განაწილება. კითხვები ასეთია. თუ a ნებისმიერი რიცხვია, 0·a რას უდრის. 27+27+27+27+27 როგორ დაიწეროს გამრავლებით. თუ a=7, რას უდრის 8a. თუ a=0, რას უდრის 11a. 7(a+c) როგორ გაიხსნას.</w:t>
+        <w:t>პირველ კითხვას წყვილი ერთად ხსნის და ხმამაღლა ამბობს მიზეზს. დანარჩენ ოთხს ცალ-ცალკე წერენ, რომ ჩანდეს, ვის რა გამოუვიდა. მიზეზი აუცილებელია: ნულის თვისებაა, ხუთი ერთნაირი შესაკრებია თუ განრიგებადობა. კითხვები: თუ a ნებისმიერი რიცხვია, რას უდრის 0·a; 27+27+27+27+27 როგორ დაიწეროს გამრავლებით; თუ a=7, რას უდრის 8a; თუ a=0, რას უდრის 11a; 7(a+c) როგორ გაიხსნას. იგივეა (a+c)·7.</w:t>
       </w:r>
     </w:p>
     <w:p>
@@ -592,7 +697,100 @@
           <w:color w:val="1C2430"/>
           <w:sz w:val="24"/>
         </w:rPr>
-        <w:t>ბოლოს სამ წინადადებაში იკრიბება გაკვეთილი: ადგილის გაცვლა ნამრავლს არ ცვლის; ერთი რიცხვს არ ცვლის, ნული ნულს იძლევა; 8a გამოსახულებაა, 8a=56 ტოლობაა, 8a&gt;50 უტოლობაა.</w:t>
+        <w:t>სამი მოსწავლე ბოლოს თითო წინადადებას ამბობს თავისი სიტყვით. ერთი — გადანაცვლებადობას, მეორე — იმას, რომ ერთზე გამრავლება რიცხვს არ ცვლის, მესამე — 8a გამოსახულებაა, 8a=56 ტოლობაა, 8a&gt;50 უტოლობაა.</w:t>
+      </w:r>
+    </w:p>
+    <w:p>
+      <w:pPr>
+        <w:spacing w:before="240" w:after="80" w:line="259" w:lineRule="auto"/>
+      </w:pPr>
+      <w:r>
+        <w:rPr>
+          <w:rFonts w:ascii="Sylfaen" w:hAnsi="Sylfaen" w:cs="Sylfaen" w:eastAsia="Sylfaen"/>
+          <w:b/>
+          <w:i w:val="0"/>
+          <w:color w:val="8E2F3C"/>
+          <w:sz w:val="28"/>
+        </w:rPr>
+        <w:t>თუ აერია</w:t>
+      </w:r>
+    </w:p>
+    <w:p>
+      <w:pPr>
+        <w:spacing w:before="0" w:after="40" w:line="259" w:lineRule="auto"/>
+        <w:ind w:left="340"/>
+      </w:pPr>
+      <w:r>
+        <w:rPr>
+          <w:rFonts w:ascii="Sylfaen" w:hAnsi="Sylfaen" w:cs="Sylfaen" w:eastAsia="Sylfaen"/>
+          <w:b w:val="0"/>
+          <w:i w:val="0"/>
+          <w:color w:val="1C2430"/>
+          <w:sz w:val="22"/>
+        </w:rPr>
+        <w:t>•  0·a-ზე თუ a თქვა, შეადაროს 1-ზე გამრავლებას და უთხრან: ნულს a რამდენჯერ ემატება? თუ კიდევ ჩერდება, რვეულში წერს 0+0+0.</w:t>
+      </w:r>
+    </w:p>
+    <w:p>
+      <w:pPr>
+        <w:spacing w:before="0" w:after="40" w:line="259" w:lineRule="auto"/>
+        <w:ind w:left="340"/>
+      </w:pPr>
+      <w:r>
+        <w:rPr>
+          <w:rFonts w:ascii="Sylfaen" w:hAnsi="Sylfaen" w:cs="Sylfaen" w:eastAsia="Sylfaen"/>
+          <w:b w:val="0"/>
+          <w:i w:val="0"/>
+          <w:color w:val="1C2430"/>
+          <w:sz w:val="22"/>
+        </w:rPr>
+        <w:t>•  7(a+c) თუ გახსნა როგორც 7a+c, მეორე შესაკრებზეც უნდა გამრავლდეს: 7·c. ჯერ რიცხვით, 7·(2+3)=14+21, მერე ასოთი.</w:t>
+      </w:r>
+    </w:p>
+    <w:p>
+      <w:pPr>
+        <w:spacing w:before="0" w:after="40" w:line="259" w:lineRule="auto"/>
+        <w:ind w:left="340"/>
+      </w:pPr>
+      <w:r>
+        <w:rPr>
+          <w:rFonts w:ascii="Sylfaen" w:hAnsi="Sylfaen" w:cs="Sylfaen" w:eastAsia="Sylfaen"/>
+          <w:b w:val="0"/>
+          <w:i w:val="0"/>
+          <w:color w:val="1C2430"/>
+          <w:sz w:val="22"/>
+        </w:rPr>
+        <w:t>•  გამოსახულებას თუ = დაუწერა, ჰკითხონ, სად არის მეორე მხარე. სანამ მეორე მხარე არ არის, ჩანაწერი გამოსახულებად რჩება.</w:t>
+      </w:r>
+    </w:p>
+    <w:p>
+      <w:pPr>
+        <w:spacing w:before="240" w:after="80" w:line="259" w:lineRule="auto"/>
+      </w:pPr>
+      <w:r>
+        <w:rPr>
+          <w:rFonts w:ascii="Sylfaen" w:hAnsi="Sylfaen" w:cs="Sylfaen" w:eastAsia="Sylfaen"/>
+          <w:b/>
+          <w:i w:val="0"/>
+          <w:color w:val="8E2F3C"/>
+          <w:sz w:val="28"/>
+        </w:rPr>
+        <w:t>ვინ როგორ მუშაობს</w:t>
+      </w:r>
+    </w:p>
+    <w:p>
+      <w:pPr>
+        <w:spacing w:before="0" w:after="120" w:line="269" w:lineRule="auto"/>
+      </w:pPr>
+      <w:r>
+        <w:rPr>
+          <w:rFonts w:ascii="Sylfaen" w:hAnsi="Sylfaen" w:cs="Sylfaen" w:eastAsia="Sylfaen"/>
+          <w:b w:val="0"/>
+          <w:i w:val="0"/>
+          <w:color w:val="1C2430"/>
+          <w:sz w:val="24"/>
+        </w:rPr>
+        <w:t>მიზანი ყველასთვის ერთია. იცვლება გზა და ის, რასაც ბოლოს აბარებს. აღმოჩენა ჰეტეროგენულ წყვილშია, სახელის დარქმევა მთელ კლასთან, გვ. 57-ის ბოლო ოთხი კითხვა ცალ-ცალკე. ვისაც უჭირს, ბარათზე შეკრება უკვე გახსნილი ხვდება და 5·9+5·4-ზე რჩება; ასოზე მაშინ გადადის, როცა ორი გზა უკვე ერთ რიცხვს იძლევა. პროდუქტი მოკლეა: ორი გზა და 4a+5a. ვისაც ადვილად გამოსდის, იმავე ამოცანის შემდეგ თავად წერს ერთ უტოლობას a-თი და ხსნის a(b−c)-ს.</w:t>
       </w:r>
     </w:p>
     <w:p>
@@ -623,7 +821,7 @@
           <w:color w:val="1C2430"/>
           <w:sz w:val="22"/>
         </w:rPr>
-        <w:t>•  გვ. 57, №1–№5 რვეულში. კლასში ნანახიც მოკლედ ჩაიწერონ.</w:t>
+        <w:t>•  გვ. 57, №1–№5 რვეულში. კლასში ნანახიც მოკლედ ჩაიწერონ, მიზეზით.</w:t>
       </w:r>
     </w:p>
     <w:p>
@@ -1049,7 +1247,7 @@
                 <w:color w:val="1C2430"/>
                 <w:sz w:val="22"/>
               </w:rPr>
-              <w:t>7(a + c) = 7a + 7c</w:t>
+              <w:t>7(a + c) = 7a + 7c. იგივეა (a + c) · 7</w:t>
             </w:r>
           </w:p>
         </w:tc>

</xml_diff>

<commit_message>
Fill Gia's scheme template in its original form.
Keep the table, labels and blank slots, name Beka Tevdorashvili as the author, and drop the separately designed scheme file.

Co-authored-by: Beka Tevdorashvili <bekatev@users.noreply.github.com>
</commit_message>
<xml_diff>
--- a/lesson/sagakvetilo-gegma.docx
+++ b/lesson/sagakvetilo-gegma.docx
@@ -181,6 +181,83 @@
                 <w:sz w:val="22"/>
               </w:rPr>
               <w:t>ნატურალური რიცხვების გამრავლება. გამრავლების თვისებები</w:t>
+            </w:r>
+          </w:p>
+        </w:tc>
+      </w:tr>
+      <w:tr>
+        <w:trPr>
+          <w:cantSplit/>
+        </w:trPr>
+        <w:tc>
+          <w:tcPr>
+            <w:tcW w:type="dxa" w:w="2381"/>
+            <w:shd w:val="clear" w:fill="FBF6EE"/>
+            <w:tcBorders>
+              <w:top w:val="single" w:sz="4" w:space="0" w:color="E7DCCB"/>
+              <w:left w:val="single" w:sz="4" w:space="0" w:color="E7DCCB"/>
+              <w:bottom w:val="single" w:sz="4" w:space="0" w:color="E7DCCB"/>
+              <w:right w:val="single" w:sz="4" w:space="0" w:color="E7DCCB"/>
+            </w:tcBorders>
+            <w:tcMar>
+              <w:top w:w="60" w:type="dxa"/>
+              <w:left w:w="80" w:type="dxa"/>
+              <w:bottom w:w="60" w:type="dxa"/>
+              <w:right w:w="80" w:type="dxa"/>
+            </w:tcMar>
+            <w:vAlign w:val="center"/>
+          </w:tcPr>
+          <w:p>
+            <w:pPr>
+              <w:spacing w:before="0" w:after="0" w:line="252" w:lineRule="auto"/>
+              <w:jc w:val="left"/>
+            </w:pPr>
+            <w:r/>
+            <w:r>
+              <w:rPr>
+                <w:rFonts w:ascii="Sylfaen" w:hAnsi="Sylfaen" w:cs="Sylfaen" w:eastAsia="Sylfaen"/>
+                <w:b/>
+                <w:i w:val="0"/>
+                <w:color w:val="8E2F3C"/>
+                <w:sz w:val="22"/>
+              </w:rPr>
+              <w:t>ავტორი</w:t>
+            </w:r>
+          </w:p>
+        </w:tc>
+        <w:tc>
+          <w:tcPr>
+            <w:tcW w:type="dxa" w:w="7597"/>
+            <w:shd w:val="clear" w:fill="FFFFFF"/>
+            <w:tcBorders>
+              <w:top w:val="single" w:sz="4" w:space="0" w:color="E7DCCB"/>
+              <w:left w:val="single" w:sz="4" w:space="0" w:color="E7DCCB"/>
+              <w:bottom w:val="single" w:sz="4" w:space="0" w:color="E7DCCB"/>
+              <w:right w:val="single" w:sz="4" w:space="0" w:color="E7DCCB"/>
+            </w:tcBorders>
+            <w:tcMar>
+              <w:top w:w="60" w:type="dxa"/>
+              <w:left w:w="80" w:type="dxa"/>
+              <w:bottom w:w="60" w:type="dxa"/>
+              <w:right w:w="80" w:type="dxa"/>
+            </w:tcMar>
+            <w:vAlign w:val="center"/>
+          </w:tcPr>
+          <w:p>
+            <w:pPr>
+              <w:spacing w:before="0" w:after="0" w:line="252" w:lineRule="auto"/>
+              <w:jc w:val="left"/>
+            </w:pPr>
+            <w:r/>
+            <w:r>
+              <w:rPr>
+                <w:rFonts w:ascii="Sylfaen" w:hAnsi="Sylfaen" w:cs="Sylfaen" w:eastAsia="Sylfaen"/>
+                <w:b w:val="0"/>
+                <w:i w:val="0"/>
+                <w:color w:val="1C2430"/>
+                <w:sz w:val="22"/>
+              </w:rPr>
+              <w:t>ბექა თევდორაშვილი</w:t>
             </w:r>
           </w:p>
         </w:tc>

</xml_diff>